<commit_message>
Technical pack aligned with the licence, subscription and source-code options
Deployment chapter covers IIFT-procured on-premise, iorta-hosted cloud in
the Malaysia regions with landing zone, DR region, cost controls and
shared responsibility; handover adds the managed services operating
model and the source-code transition with the 8-week knowledge transfer.
Commercial facts are read from the proposal pricing data.
</commit_message>
<xml_diff>
--- a/docs/technical/SalesVerse-2.0-Code-Standards-and-Quality-Report.docx
+++ b/docs/technical/SalesVerse-2.0-Code-Standards-and-Quality-Report.docx
@@ -7,22 +7,38 @@
         <w:spacing w:after="560"/>
       </w:pPr>
       <w:r>
-        <w:rPr>
-          <w:b/>
-          <w:i w:val="0"/>
-          <w:color w:val="E1058C"/>
-          <w:sz w:val="52"/>
-        </w:rPr>
-        <w:t>iorta</w:t>
-      </w:r>
-      <w:r>
-        <w:rPr>
-          <w:b w:val="0"/>
-          <w:i w:val="0"/>
-          <w:color w:val="333333"/>
-          <w:sz w:val="52"/>
-        </w:rPr>
-        <w:t xml:space="preserve"> TechNXT</w:t>
+        <w:drawing>
+          <wp:inline xmlns:a="http://schemas.openxmlformats.org/drawingml/2006/main" xmlns:pic="http://schemas.openxmlformats.org/drawingml/2006/picture">
+            <wp:extent cx="1871238" cy="576000"/>
+            <wp:docPr id="1" name="Picture 1"/>
+            <wp:cNvGraphicFramePr>
+              <a:graphicFrameLocks noChangeAspect="1"/>
+            </wp:cNvGraphicFramePr>
+            <a:graphic>
+              <a:graphicData uri="http://schemas.openxmlformats.org/drawingml/2006/picture">
+                <pic:pic>
+                  <pic:nvPicPr>
+                    <pic:cNvPr id="0" name="iorta-logo.png"/>
+                    <pic:cNvPicPr/>
+                  </pic:nvPicPr>
+                  <pic:blipFill>
+                    <a:blip r:embed="rId11"/>
+                    <a:stretch>
+                      <a:fillRect/>
+                    </a:stretch>
+                  </pic:blipFill>
+                  <pic:spPr>
+                    <a:xfrm>
+                      <a:off x="0" y="0"/>
+                      <a:ext cx="1871238" cy="576000"/>
+                    </a:xfrm>
+                    <a:prstGeom prst="rect"/>
+                  </pic:spPr>
+                </pic:pic>
+              </a:graphicData>
+            </a:graphic>
+          </wp:inline>
+        </w:drawing>
       </w:r>
     </w:p>
     <w:p>
@@ -30,7 +46,7 @@
         <w:drawing>
           <wp:inline xmlns:a="http://schemas.openxmlformats.org/drawingml/2006/main" xmlns:pic="http://schemas.openxmlformats.org/drawingml/2006/picture">
             <wp:extent cx="6120000" cy="214200"/>
-            <wp:docPr id="1" name="Picture 1"/>
+            <wp:docPr id="2" name="Picture 2"/>
             <wp:cNvGraphicFramePr>
               <a:graphicFrameLocks noChangeAspect="1"/>
             </wp:cNvGraphicFramePr>
@@ -42,7 +58,7 @@
                     <pic:cNvPicPr/>
                   </pic:nvPicPr>
                   <pic:blipFill>
-                    <a:blip r:embed="rId11"/>
+                    <a:blip r:embed="rId12"/>
                     <a:stretch>
                       <a:fillRect/>
                     </a:stretch>
@@ -250,7 +266,7 @@
                 <w:i w:val="0"/>
                 <w:sz w:val="18"/>
               </w:rPr>
-              <w:t>Commit 47f239c</w:t>
+              <w:t>Commit f7fbadd</w:t>
             </w:r>
           </w:p>
         </w:tc>
@@ -523,7 +539,7 @@
           <w:b w:val="0"/>
           <w:i w:val="0"/>
         </w:rPr>
-        <w:t>This report describes the coding standards used to build SalesVerse 2.0 and the quality evidence for the current build (commit 47f239c). All results are produced by tools, not by assessment, and the report is rebuilt from the evidence files each time they are refreshed.</w:t>
+        <w:t>This report describes the coding standards used to build SalesVerse 2.0 and the quality evidence for the current build (commit f7fbadd). All results are produced by tools, not by assessment, and the report is rebuilt from the evidence files each time they are refreshed.</w:t>
       </w:r>
     </w:p>
     <w:tbl>
@@ -25947,11 +25963,54 @@
   <w:p>
     <w:pPr>
       <w:pStyle w:val="Header"/>
-      <w:jc w:val="right"/>
+      <w:tabs>
+        <w:tab w:pos="4680" w:val="clear"/>
+        <w:tab w:pos="9360" w:val="clear"/>
+        <w:tab w:pos="9638" w:val="right"/>
+      </w:tabs>
+      <w:spacing w:after="0"/>
+      <w:jc w:val="left"/>
       <w:pBdr>
         <w:bottom w:val="single" w:sz="6" w:space="2" w:color="F58220"/>
       </w:pBdr>
     </w:pPr>
+    <w:r>
+      <w:drawing>
+        <wp:inline xmlns:a="http://schemas.openxmlformats.org/drawingml/2006/main" xmlns:pic="http://schemas.openxmlformats.org/drawingml/2006/picture">
+          <wp:extent cx="725105" cy="223200"/>
+          <wp:docPr id="1" name="Picture 1"/>
+          <wp:cNvGraphicFramePr>
+            <a:graphicFrameLocks noChangeAspect="1"/>
+          </wp:cNvGraphicFramePr>
+          <a:graphic>
+            <a:graphicData uri="http://schemas.openxmlformats.org/drawingml/2006/picture">
+              <pic:pic>
+                <pic:nvPicPr>
+                  <pic:cNvPr id="0" name="iorta-logo.png"/>
+                  <pic:cNvPicPr/>
+                </pic:nvPicPr>
+                <pic:blipFill>
+                  <a:blip r:embed="rId1"/>
+                  <a:stretch>
+                    <a:fillRect/>
+                  </a:stretch>
+                </pic:blipFill>
+                <pic:spPr>
+                  <a:xfrm>
+                    <a:off x="0" y="0"/>
+                    <a:ext cx="725105" cy="223200"/>
+                  </a:xfrm>
+                  <a:prstGeom prst="rect"/>
+                </pic:spPr>
+              </pic:pic>
+            </a:graphicData>
+          </a:graphic>
+        </wp:inline>
+      </w:drawing>
+    </w:r>
+    <w:r>
+      <w:tab/>
+    </w:r>
     <w:r>
       <w:rPr>
         <w:b w:val="0"/>

</xml_diff>

<commit_message>
Technical pack rebuilt: test strategy and cases, handover and architecture updates
</commit_message>
<xml_diff>
--- a/docs/technical/SalesVerse-2.0-Code-Standards-and-Quality-Report.docx
+++ b/docs/technical/SalesVerse-2.0-Code-Standards-and-Quality-Report.docx
@@ -266,7 +266,7 @@
                 <w:i w:val="0"/>
                 <w:sz w:val="18"/>
               </w:rPr>
-              <w:t>Commit f7fbadd</w:t>
+              <w:t>Commit d161514</w:t>
             </w:r>
           </w:p>
         </w:tc>
@@ -539,7 +539,7 @@
           <w:b w:val="0"/>
           <w:i w:val="0"/>
         </w:rPr>
-        <w:t>This report describes the coding standards used to build SalesVerse 2.0 and the quality evidence for the current build (commit f7fbadd). All results are produced by tools, not by assessment, and the report is rebuilt from the evidence files each time they are refreshed.</w:t>
+        <w:t>This report describes the coding standards used to build SalesVerse 2.0 and the quality evidence for the current build (commit d161514). All results are produced by tools, not by assessment, and the report is rebuilt from the evidence files each time they are refreshed.</w:t>
       </w:r>
     </w:p>
     <w:tbl>
@@ -25204,7 +25204,7 @@
                 <w:i w:val="0"/>
                 <w:sz w:val="16"/>
               </w:rPr>
-              <w:t>api-unit-coverage-summary.json</w:t>
+              <w:t>api-test-run.json</w:t>
             </w:r>
           </w:p>
         </w:tc>
@@ -25224,7 +25224,7 @@
                 <w:i w:val="0"/>
                 <w:sz w:val="16"/>
               </w:rPr>
-              <w:t>41,871 bytes</w:t>
+              <w:t>62,933 bytes</w:t>
             </w:r>
           </w:p>
         </w:tc>
@@ -25244,7 +25244,7 @@
                 <w:i w:val="0"/>
                 <w:sz w:val="16"/>
               </w:rPr>
-              <w:t>501662d3899973ad…</w:t>
+              <w:t>bf46e22aaf170745…</w:t>
             </w:r>
           </w:p>
         </w:tc>
@@ -25268,7 +25268,7 @@
                 <w:i w:val="0"/>
                 <w:sz w:val="16"/>
               </w:rPr>
-              <w:t>api-unit-tests.json</w:t>
+              <w:t>api-unit-coverage-summary.json</w:t>
             </w:r>
           </w:p>
         </w:tc>
@@ -25287,7 +25287,7 @@
                 <w:i w:val="0"/>
                 <w:sz w:val="16"/>
               </w:rPr>
-              <w:t>901,653 bytes</w:t>
+              <w:t>41,871 bytes</w:t>
             </w:r>
           </w:p>
         </w:tc>
@@ -25306,7 +25306,7 @@
                 <w:i w:val="0"/>
                 <w:sz w:val="16"/>
               </w:rPr>
-              <w:t>04b9d616f28c707b…</w:t>
+              <w:t>501662d3899973ad…</w:t>
             </w:r>
           </w:p>
         </w:tc>
@@ -25331,7 +25331,7 @@
                 <w:i w:val="0"/>
                 <w:sz w:val="16"/>
               </w:rPr>
-              <w:t>code-metrics-api.json</w:t>
+              <w:t>api-unit-tests.json</w:t>
             </w:r>
           </w:p>
         </w:tc>
@@ -25351,7 +25351,7 @@
                 <w:i w:val="0"/>
                 <w:sz w:val="16"/>
               </w:rPr>
-              <w:t>760 bytes</w:t>
+              <w:t>901,653 bytes</w:t>
             </w:r>
           </w:p>
         </w:tc>
@@ -25371,7 +25371,7 @@
                 <w:i w:val="0"/>
                 <w:sz w:val="16"/>
               </w:rPr>
-              <w:t>ec37c59d47c8708c…</w:t>
+              <w:t>04b9d616f28c707b…</w:t>
             </w:r>
           </w:p>
         </w:tc>
@@ -25395,7 +25395,7 @@
                 <w:i w:val="0"/>
                 <w:sz w:val="16"/>
               </w:rPr>
-              <w:t>npm-audit.json</w:t>
+              <w:t>code-metrics-api.json</w:t>
             </w:r>
           </w:p>
         </w:tc>
@@ -25414,7 +25414,7 @@
                 <w:i w:val="0"/>
                 <w:sz w:val="16"/>
               </w:rPr>
-              <w:t>366 bytes</w:t>
+              <w:t>760 bytes</w:t>
             </w:r>
           </w:p>
         </w:tc>
@@ -25433,7 +25433,7 @@
                 <w:i w:val="0"/>
                 <w:sz w:val="16"/>
               </w:rPr>
-              <w:t>1cf279e9ef691d09…</w:t>
+              <w:t>ec37c59d47c8708c…</w:t>
             </w:r>
           </w:p>
         </w:tc>
@@ -25458,7 +25458,7 @@
                 <w:i w:val="0"/>
                 <w:sz w:val="16"/>
               </w:rPr>
-              <w:t>runtime-dependency-licences.json</w:t>
+              <w:t>npm-audit.json</w:t>
             </w:r>
           </w:p>
         </w:tc>
@@ -25478,7 +25478,7 @@
                 <w:i w:val="0"/>
                 <w:sz w:val="16"/>
               </w:rPr>
-              <w:t>40,391 bytes</w:t>
+              <w:t>366 bytes</w:t>
             </w:r>
           </w:p>
         </w:tc>
@@ -25498,7 +25498,7 @@
                 <w:i w:val="0"/>
                 <w:sz w:val="16"/>
               </w:rPr>
-              <w:t>b003a0dc1a75e06f…</w:t>
+              <w:t>1cf279e9ef691d09…</w:t>
             </w:r>
           </w:p>
         </w:tc>
@@ -25522,6 +25522,69 @@
                 <w:i w:val="0"/>
                 <w:sz w:val="16"/>
               </w:rPr>
+              <w:t>runtime-dependency-licences.json</w:t>
+            </w:r>
+          </w:p>
+        </w:tc>
+        <w:tc>
+          <w:tcPr>
+            <w:tcW w:type="dxa" w:w="1701"/>
+            <w:vAlign w:val="top"/>
+          </w:tcPr>
+          <w:p>
+            <w:pPr>
+              <w:spacing w:after="20" w:line="252" w:lineRule="auto"/>
+            </w:pPr>
+            <w:r>
+              <w:rPr>
+                <w:b w:val="0"/>
+                <w:i w:val="0"/>
+                <w:sz w:val="16"/>
+              </w:rPr>
+              <w:t>40,391 bytes</w:t>
+            </w:r>
+          </w:p>
+        </w:tc>
+        <w:tc>
+          <w:tcPr>
+            <w:tcW w:type="dxa" w:w="3855"/>
+            <w:vAlign w:val="top"/>
+          </w:tcPr>
+          <w:p>
+            <w:pPr>
+              <w:spacing w:after="20" w:line="252" w:lineRule="auto"/>
+            </w:pPr>
+            <w:r>
+              <w:rPr>
+                <w:b w:val="0"/>
+                <w:i w:val="0"/>
+                <w:sz w:val="16"/>
+              </w:rPr>
+              <w:t>b003a0dc1a75e06f…</w:t>
+            </w:r>
+          </w:p>
+        </w:tc>
+      </w:tr>
+      <w:tr>
+        <w:trPr>
+          <w:cantSplit/>
+        </w:trPr>
+        <w:tc>
+          <w:tcPr>
+            <w:tcW w:type="dxa" w:w="4082"/>
+            <w:vAlign w:val="top"/>
+            <w:shd w:val="clear" w:color="auto" w:fill="FDF0F7"/>
+          </w:tcPr>
+          <w:p>
+            <w:pPr>
+              <w:spacing w:after="20" w:line="252" w:lineRule="auto"/>
+            </w:pPr>
+            <w:r>
+              <w:rPr>
+                <w:b w:val="0"/>
+                <w:i w:val="0"/>
+                <w:sz w:val="16"/>
+              </w:rPr>
               <w:t>security-checks.json</w:t>
             </w:r>
           </w:p>
@@ -25530,6 +25593,7 @@
           <w:tcPr>
             <w:tcW w:type="dxa" w:w="1701"/>
             <w:vAlign w:val="top"/>
+            <w:shd w:val="clear" w:color="auto" w:fill="FDF0F7"/>
           </w:tcPr>
           <w:p>
             <w:pPr>
@@ -25549,6 +25613,7 @@
           <w:tcPr>
             <w:tcW w:type="dxa" w:w="3855"/>
             <w:vAlign w:val="top"/>
+            <w:shd w:val="clear" w:color="auto" w:fill="FDF0F7"/>
           </w:tcPr>
           <w:p>
             <w:pPr>
@@ -25561,6 +25626,68 @@
                 <w:sz w:val="16"/>
               </w:rPr>
               <w:t>5ab9bdeea3c926fd…</w:t>
+            </w:r>
+          </w:p>
+        </w:tc>
+      </w:tr>
+      <w:tr>
+        <w:trPr>
+          <w:cantSplit/>
+        </w:trPr>
+        <w:tc>
+          <w:tcPr>
+            <w:tcW w:type="dxa" w:w="4082"/>
+            <w:vAlign w:val="top"/>
+          </w:tcPr>
+          <w:p>
+            <w:pPr>
+              <w:spacing w:after="20" w:line="252" w:lineRule="auto"/>
+            </w:pPr>
+            <w:r>
+              <w:rPr>
+                <w:b w:val="0"/>
+                <w:i w:val="0"/>
+                <w:sz w:val="16"/>
+              </w:rPr>
+              <w:t>test-reruns.json</w:t>
+            </w:r>
+          </w:p>
+        </w:tc>
+        <w:tc>
+          <w:tcPr>
+            <w:tcW w:type="dxa" w:w="1701"/>
+            <w:vAlign w:val="top"/>
+          </w:tcPr>
+          <w:p>
+            <w:pPr>
+              <w:spacing w:after="20" w:line="252" w:lineRule="auto"/>
+            </w:pPr>
+            <w:r>
+              <w:rPr>
+                <w:b w:val="0"/>
+                <w:i w:val="0"/>
+                <w:sz w:val="16"/>
+              </w:rPr>
+              <w:t>40,047 bytes</w:t>
+            </w:r>
+          </w:p>
+        </w:tc>
+        <w:tc>
+          <w:tcPr>
+            <w:tcW w:type="dxa" w:w="3855"/>
+            <w:vAlign w:val="top"/>
+          </w:tcPr>
+          <w:p>
+            <w:pPr>
+              <w:spacing w:after="20" w:line="252" w:lineRule="auto"/>
+            </w:pPr>
+            <w:r>
+              <w:rPr>
+                <w:b w:val="0"/>
+                <w:i w:val="0"/>
+                <w:sz w:val="16"/>
+              </w:rPr>
+              <w:t>99a7e747f67f05b0…</w:t>
             </w:r>
           </w:p>
         </w:tc>

</xml_diff>

<commit_message>
Refresh web evidence (94 tests) and the quality report
</commit_message>
<xml_diff>
--- a/docs/technical/SalesVerse-2.0-Code-Standards-and-Quality-Report.docx
+++ b/docs/technical/SalesVerse-2.0-Code-Standards-and-Quality-Report.docx
@@ -266,7 +266,7 @@
                 <w:i w:val="0"/>
                 <w:sz w:val="18"/>
               </w:rPr>
-              <w:t>Commit d161514</w:t>
+              <w:t>Commit f20483e</w:t>
             </w:r>
           </w:p>
         </w:tc>
@@ -539,7 +539,7 @@
           <w:b w:val="0"/>
           <w:i w:val="0"/>
         </w:rPr>
-        <w:t>This report describes the coding standards used to build SalesVerse 2.0 and the quality evidence for the current build (commit d161514). All results are produced by tools, not by assessment, and the report is rebuilt from the evidence files each time they are refreshed.</w:t>
+        <w:t>This report describes the coding standards used to build SalesVerse 2.0 and the quality evidence for the current build (commit f20483e). All results are produced by tools, not by assessment, and the report is rebuilt from the evidence files each time they are refreshed.</w:t>
       </w:r>
     </w:p>
     <w:tbl>
@@ -875,7 +875,7 @@
                 <w:i w:val="0"/>
                 <w:sz w:val="17"/>
               </w:rPr>
-              <w:t>81 of 81 passed</w:t>
+              <w:t>94 of 94 passed</w:t>
             </w:r>
           </w:p>
         </w:tc>
@@ -1094,7 +1094,7 @@
                 <w:i w:val="0"/>
                 <w:sz w:val="17"/>
               </w:rPr>
-              <w:t>0 errors, 0 warnings (184 files, 213 rules)</w:t>
+              <w:t>0 errors, 0 warnings (203 files, 213 rules)</w:t>
             </w:r>
           </w:p>
         </w:tc>
@@ -1182,7 +1182,7 @@
                 <w:i w:val="0"/>
                 <w:sz w:val="17"/>
               </w:rPr>
-              <w:t>No errors reported; largest chunk antd 1,378.82 kB (437.98 kB gzip)</w:t>
+              <w:t>No errors reported; largest chunk antd 1,378.34 kB (437.01 kB gzip)</w:t>
             </w:r>
           </w:p>
         </w:tc>
@@ -4060,7 +4060,7 @@
                 <w:i w:val="0"/>
                 <w:sz w:val="16"/>
               </w:rPr>
-              <w:t>0 errors, 0 warnings (184 files, 213 rules)</w:t>
+              <w:t>0 errors, 0 warnings (203 files, 213 rules)</w:t>
             </w:r>
           </w:p>
         </w:tc>
@@ -4148,7 +4148,7 @@
                 <w:i w:val="0"/>
                 <w:sz w:val="16"/>
               </w:rPr>
-              <w:t>No errors reported; largest chunk antd 1,378.82 kB (437.98 kB gzip)</w:t>
+              <w:t>No errors reported; largest chunk antd 1,378.34 kB (437.01 kB gzip)</w:t>
             </w:r>
           </w:p>
         </w:tc>
@@ -4644,7 +4644,7 @@
                 <w:i w:val="0"/>
                 <w:sz w:val="17"/>
               </w:rPr>
-              <w:t>16</w:t>
+              <w:t>19</w:t>
             </w:r>
           </w:p>
         </w:tc>
@@ -4664,7 +4664,7 @@
                 <w:i w:val="0"/>
                 <w:sz w:val="17"/>
               </w:rPr>
-              <w:t>81</w:t>
+              <w:t>94</w:t>
             </w:r>
           </w:p>
         </w:tc>
@@ -4684,7 +4684,7 @@
                 <w:i w:val="0"/>
                 <w:sz w:val="17"/>
               </w:rPr>
-              <w:t>81</w:t>
+              <w:t>94</w:t>
             </w:r>
           </w:p>
         </w:tc>
@@ -4723,7 +4723,7 @@
                 <w:i w:val="0"/>
                 <w:sz w:val="17"/>
               </w:rPr>
-              <w:t>2 October 2026, 14:56 UTC</w:t>
+              <w:t>3 October 2026, 03:05 UTC</w:t>
             </w:r>
           </w:p>
         </w:tc>
@@ -6372,7 +6372,7 @@
                 <w:i w:val="0"/>
                 <w:sz w:val="16"/>
               </w:rPr>
-              <w:t>12</w:t>
+              <w:t>13</w:t>
             </w:r>
           </w:p>
         </w:tc>
@@ -6393,7 +6393,7 @@
                 <w:i w:val="0"/>
                 <w:sz w:val="16"/>
               </w:rPr>
-              <w:t>12</w:t>
+              <w:t>13</w:t>
             </w:r>
           </w:p>
         </w:tc>
@@ -6501,7 +6501,7 @@
                 <w:i w:val="0"/>
                 <w:sz w:val="16"/>
               </w:rPr>
-              <w:t>Money.test.tsx</w:t>
+              <w:t>FieldGrid.test.tsx</w:t>
             </w:r>
           </w:p>
         </w:tc>
@@ -6521,7 +6521,7 @@
                 <w:i w:val="0"/>
                 <w:sz w:val="16"/>
               </w:rPr>
-              <w:t>Amount display</w:t>
+              <w:t>See test titles in the annex</w:t>
             </w:r>
           </w:p>
         </w:tc>
@@ -6542,7 +6542,7 @@
                 <w:i w:val="0"/>
                 <w:sz w:val="16"/>
               </w:rPr>
-              <w:t>2</w:t>
+              <w:t>3</w:t>
             </w:r>
           </w:p>
         </w:tc>
@@ -6563,7 +6563,7 @@
                 <w:i w:val="0"/>
                 <w:sz w:val="16"/>
               </w:rPr>
-              <w:t>2</w:t>
+              <w:t>3</w:t>
             </w:r>
           </w:p>
         </w:tc>
@@ -6587,7 +6587,7 @@
                 <w:i w:val="0"/>
                 <w:sz w:val="16"/>
               </w:rPr>
-              <w:t>RequirePermission.test.tsx</w:t>
+              <w:t>Money.test.tsx</w:t>
             </w:r>
           </w:p>
         </w:tc>
@@ -6606,7 +6606,7 @@
                 <w:i w:val="0"/>
                 <w:sz w:val="16"/>
               </w:rPr>
-              <w:t>Pages shown only to users holding the permission</w:t>
+              <w:t>Amount display</w:t>
             </w:r>
           </w:p>
         </w:tc>
@@ -6671,7 +6671,7 @@
                 <w:i w:val="0"/>
                 <w:sz w:val="16"/>
               </w:rPr>
-              <w:t>StatusTag.test.tsx</w:t>
+              <w:t>PageHeader.test.tsx</w:t>
             </w:r>
           </w:p>
         </w:tc>
@@ -6691,7 +6691,7 @@
                 <w:i w:val="0"/>
                 <w:sz w:val="16"/>
               </w:rPr>
-              <w:t>Status labels and colours</w:t>
+              <w:t>See test titles in the annex</w:t>
             </w:r>
           </w:p>
         </w:tc>
@@ -6712,7 +6712,7 @@
                 <w:i w:val="0"/>
                 <w:sz w:val="16"/>
               </w:rPr>
-              <w:t>3</w:t>
+              <w:t>2</w:t>
             </w:r>
           </w:p>
         </w:tc>
@@ -6733,7 +6733,7 @@
                 <w:i w:val="0"/>
                 <w:sz w:val="16"/>
               </w:rPr>
-              <w:t>3</w:t>
+              <w:t>2</w:t>
             </w:r>
           </w:p>
         </w:tc>
@@ -6757,7 +6757,7 @@
                 <w:i w:val="0"/>
                 <w:sz w:val="16"/>
               </w:rPr>
-              <w:t>menus.test.ts</w:t>
+              <w:t>RequirePermission.test.tsx</w:t>
             </w:r>
           </w:p>
         </w:tc>
@@ -6776,7 +6776,7 @@
                 <w:i w:val="0"/>
                 <w:sz w:val="16"/>
               </w:rPr>
-              <w:t>Menu highlighting for the current page</w:t>
+              <w:t>Pages shown only to users holding the permission</w:t>
             </w:r>
           </w:p>
         </w:tc>
@@ -6796,7 +6796,7 @@
                 <w:i w:val="0"/>
                 <w:sz w:val="16"/>
               </w:rPr>
-              <w:t>6</w:t>
+              <w:t>2</w:t>
             </w:r>
           </w:p>
         </w:tc>
@@ -6816,7 +6816,7 @@
                 <w:i w:val="0"/>
                 <w:sz w:val="16"/>
               </w:rPr>
-              <w:t>6</w:t>
+              <w:t>2</w:t>
             </w:r>
           </w:p>
         </w:tc>
@@ -6841,7 +6841,7 @@
                 <w:i w:val="0"/>
                 <w:sz w:val="16"/>
               </w:rPr>
-              <w:t>format.test.ts</w:t>
+              <w:t>StatusTag.test.tsx</w:t>
             </w:r>
           </w:p>
         </w:tc>
@@ -6861,7 +6861,7 @@
                 <w:i w:val="0"/>
                 <w:sz w:val="16"/>
               </w:rPr>
-              <w:t>Money, number, date and file-size formatting in Brunei dollars and local time</w:t>
+              <w:t>Status labels and colours</w:t>
             </w:r>
           </w:p>
         </w:tc>
@@ -6882,7 +6882,7 @@
                 <w:i w:val="0"/>
                 <w:sz w:val="16"/>
               </w:rPr>
-              <w:t>11</w:t>
+              <w:t>4</w:t>
             </w:r>
           </w:p>
         </w:tc>
@@ -6903,7 +6903,7 @@
                 <w:i w:val="0"/>
                 <w:sz w:val="16"/>
               </w:rPr>
-              <w:t>11</w:t>
+              <w:t>4</w:t>
             </w:r>
           </w:p>
         </w:tc>
@@ -6927,7 +6927,7 @@
                 <w:i w:val="0"/>
                 <w:sz w:val="16"/>
               </w:rPr>
-              <w:t>permissions.test.ts</w:t>
+              <w:t>UserMenu.test.ts</w:t>
             </w:r>
           </w:p>
         </w:tc>
@@ -6946,7 +6946,7 @@
                 <w:i w:val="0"/>
                 <w:sz w:val="16"/>
               </w:rPr>
-              <w:t>Permission codes unique, prefixed by audience, approval permissions grouped</w:t>
+              <w:t>See test titles in the annex</w:t>
             </w:r>
           </w:p>
         </w:tc>
@@ -6966,7 +6966,7 @@
                 <w:i w:val="0"/>
                 <w:sz w:val="16"/>
               </w:rPr>
-              <w:t>3</w:t>
+              <w:t>2</w:t>
             </w:r>
           </w:p>
         </w:tc>
@@ -6986,7 +6986,7 @@
                 <w:i w:val="0"/>
                 <w:sz w:val="16"/>
               </w:rPr>
-              <w:t>3</w:t>
+              <w:t>2</w:t>
             </w:r>
           </w:p>
         </w:tc>
@@ -7011,7 +7011,7 @@
                 <w:i w:val="0"/>
                 <w:sz w:val="16"/>
               </w:rPr>
-              <w:t>status.test.ts</w:t>
+              <w:t>menus.test.ts</w:t>
             </w:r>
           </w:p>
         </w:tc>
@@ -7031,7 +7031,7 @@
                 <w:i w:val="0"/>
                 <w:sz w:val="16"/>
               </w:rPr>
-              <w:t>Status colour mapping</w:t>
+              <w:t>Menu highlighting for the current page</w:t>
             </w:r>
           </w:p>
         </w:tc>
@@ -7052,7 +7052,7 @@
                 <w:i w:val="0"/>
                 <w:sz w:val="16"/>
               </w:rPr>
-              <w:t>2</w:t>
+              <w:t>8</w:t>
             </w:r>
           </w:p>
         </w:tc>
@@ -7073,7 +7073,7 @@
                 <w:i w:val="0"/>
                 <w:sz w:val="16"/>
               </w:rPr>
-              <w:t>2</w:t>
+              <w:t>8</w:t>
             </w:r>
           </w:p>
         </w:tc>
@@ -7097,7 +7097,7 @@
                 <w:i w:val="0"/>
                 <w:sz w:val="16"/>
               </w:rPr>
-              <w:t>LoginPage.test.tsx</w:t>
+              <w:t>format.test.ts</w:t>
             </w:r>
           </w:p>
         </w:tc>
@@ -7116,7 +7116,7 @@
                 <w:i w:val="0"/>
                 <w:sz w:val="16"/>
               </w:rPr>
-              <w:t>Sign-in form: validation, forced password change, rejected credentials, ended session</w:t>
+              <w:t>Money, number, date and file-size formatting in Brunei dollars and local time</w:t>
             </w:r>
           </w:p>
         </w:tc>
@@ -7136,7 +7136,7 @@
                 <w:i w:val="0"/>
                 <w:sz w:val="16"/>
               </w:rPr>
-              <w:t>6</w:t>
+              <w:t>11</w:t>
             </w:r>
           </w:p>
         </w:tc>
@@ -7156,7 +7156,7 @@
                 <w:i w:val="0"/>
                 <w:sz w:val="16"/>
               </w:rPr>
-              <w:t>6</w:t>
+              <w:t>11</w:t>
             </w:r>
           </w:p>
         </w:tc>
@@ -7181,7 +7181,7 @@
                 <w:i w:val="0"/>
                 <w:sz w:val="16"/>
               </w:rPr>
-              <w:t>CellText.test.tsx</w:t>
+              <w:t>permissions.test.ts</w:t>
             </w:r>
           </w:p>
         </w:tc>
@@ -7201,7 +7201,7 @@
                 <w:i w:val="0"/>
                 <w:sz w:val="16"/>
               </w:rPr>
-              <w:t>Table cell text</w:t>
+              <w:t>Permission codes unique, prefixed by audience, approval permissions grouped</w:t>
             </w:r>
           </w:p>
         </w:tc>
@@ -7222,7 +7222,7 @@
                 <w:i w:val="0"/>
                 <w:sz w:val="16"/>
               </w:rPr>
-              <w:t>2</w:t>
+              <w:t>3</w:t>
             </w:r>
           </w:p>
         </w:tc>
@@ -7243,7 +7243,7 @@
                 <w:i w:val="0"/>
                 <w:sz w:val="16"/>
               </w:rPr>
-              <w:t>2</w:t>
+              <w:t>3</w:t>
             </w:r>
           </w:p>
         </w:tc>
@@ -7267,7 +7267,7 @@
                 <w:i w:val="0"/>
                 <w:sz w:val="16"/>
               </w:rPr>
-              <w:t>links.test.ts</w:t>
+              <w:t>status.test.ts</w:t>
             </w:r>
           </w:p>
         </w:tc>
@@ -7286,7 +7286,7 @@
                 <w:i w:val="0"/>
                 <w:sz w:val="16"/>
               </w:rPr>
-              <w:t>Links to record pages for each audience and from notifications</w:t>
+              <w:t>Status colour mapping</w:t>
             </w:r>
           </w:p>
         </w:tc>
@@ -7306,7 +7306,7 @@
                 <w:i w:val="0"/>
                 <w:sz w:val="16"/>
               </w:rPr>
-              <w:t>5</w:t>
+              <w:t>3</w:t>
             </w:r>
           </w:p>
         </w:tc>
@@ -7326,7 +7326,7 @@
                 <w:i w:val="0"/>
                 <w:sz w:val="16"/>
               </w:rPr>
-              <w:t>5</w:t>
+              <w:t>3</w:t>
             </w:r>
           </w:p>
         </w:tc>
@@ -7351,7 +7351,7 @@
                 <w:i w:val="0"/>
                 <w:sz w:val="16"/>
               </w:rPr>
-              <w:t>values.test.ts</w:t>
+              <w:t>CellText.test.tsx</w:t>
             </w:r>
           </w:p>
         </w:tc>
@@ -7371,7 +7371,7 @@
                 <w:i w:val="0"/>
                 <w:sz w:val="16"/>
               </w:rPr>
-              <w:t>Display of approval values: hidden encrypted and hashed keys, labels, money and dates</w:t>
+              <w:t>Table cell text</w:t>
             </w:r>
           </w:p>
         </w:tc>
@@ -7392,7 +7392,7 @@
                 <w:i w:val="0"/>
                 <w:sz w:val="16"/>
               </w:rPr>
-              <w:t>8</w:t>
+              <w:t>2</w:t>
             </w:r>
           </w:p>
         </w:tc>
@@ -7413,7 +7413,7 @@
                 <w:i w:val="0"/>
                 <w:sz w:val="16"/>
               </w:rPr>
-              <w:t>8</w:t>
+              <w:t>2</w:t>
             </w:r>
           </w:p>
         </w:tc>
@@ -7437,7 +7437,7 @@
                 <w:i w:val="0"/>
                 <w:sz w:val="16"/>
               </w:rPr>
-              <w:t>NomineesEditor.test.ts</w:t>
+              <w:t>links.test.ts</w:t>
             </w:r>
           </w:p>
         </w:tc>
@@ -7456,7 +7456,7 @@
                 <w:i w:val="0"/>
                 <w:sz w:val="16"/>
               </w:rPr>
-              <w:t>Nominee rows: existing ids kept, blank ID number keeps the stored one, shares</w:t>
+              <w:t>Links to record pages for each audience and from notifications</w:t>
             </w:r>
           </w:p>
         </w:tc>
@@ -7476,7 +7476,7 @@
                 <w:i w:val="0"/>
                 <w:sz w:val="16"/>
               </w:rPr>
-              <w:t>8</w:t>
+              <w:t>5</w:t>
             </w:r>
           </w:p>
         </w:tc>
@@ -7496,7 +7496,7 @@
                 <w:i w:val="0"/>
                 <w:sz w:val="16"/>
               </w:rPr>
-              <w:t>8</w:t>
+              <w:t>5</w:t>
             </w:r>
           </w:p>
         </w:tc>
@@ -7521,7 +7521,7 @@
                 <w:i w:val="0"/>
                 <w:sz w:val="16"/>
               </w:rPr>
-              <w:t>PaymentList.test.tsx</w:t>
+              <w:t>values.test.ts</w:t>
             </w:r>
           </w:p>
         </w:tc>
@@ -7541,7 +7541,7 @@
                 <w:i w:val="0"/>
                 <w:sz w:val="16"/>
               </w:rPr>
-              <w:t>Payment list filtered by the status in the URL</w:t>
+              <w:t>Display of approval values: hidden encrypted and hashed keys, labels, money and dates</w:t>
             </w:r>
           </w:p>
         </w:tc>
@@ -7562,7 +7562,7 @@
                 <w:i w:val="0"/>
                 <w:sz w:val="16"/>
               </w:rPr>
-              <w:t>3</w:t>
+              <w:t>8</w:t>
             </w:r>
           </w:p>
         </w:tc>
@@ -7583,7 +7583,7 @@
                 <w:i w:val="0"/>
                 <w:sz w:val="16"/>
               </w:rPr>
-              <w:t>3</w:t>
+              <w:t>8</w:t>
             </w:r>
           </w:p>
         </w:tc>
@@ -7607,6 +7607,176 @@
                 <w:i w:val="0"/>
                 <w:sz w:val="16"/>
               </w:rPr>
+              <w:t>NomineesEditor.test.ts</w:t>
+            </w:r>
+          </w:p>
+        </w:tc>
+        <w:tc>
+          <w:tcPr>
+            <w:tcW w:type="dxa" w:w="5329"/>
+            <w:vAlign w:val="top"/>
+          </w:tcPr>
+          <w:p>
+            <w:pPr>
+              <w:spacing w:after="20" w:line="252" w:lineRule="auto"/>
+            </w:pPr>
+            <w:r>
+              <w:rPr>
+                <w:b w:val="0"/>
+                <w:i w:val="0"/>
+                <w:sz w:val="16"/>
+              </w:rPr>
+              <w:t>Nominee rows: existing ids kept, blank ID number keeps the stored one, shares</w:t>
+            </w:r>
+          </w:p>
+        </w:tc>
+        <w:tc>
+          <w:tcPr>
+            <w:tcW w:type="dxa" w:w="850"/>
+            <w:vAlign w:val="top"/>
+          </w:tcPr>
+          <w:p>
+            <w:pPr>
+              <w:spacing w:after="20" w:line="252" w:lineRule="auto"/>
+              <w:jc w:val="center"/>
+            </w:pPr>
+            <w:r>
+              <w:rPr>
+                <w:b w:val="0"/>
+                <w:i w:val="0"/>
+                <w:sz w:val="16"/>
+              </w:rPr>
+              <w:t>8</w:t>
+            </w:r>
+          </w:p>
+        </w:tc>
+        <w:tc>
+          <w:tcPr>
+            <w:tcW w:type="dxa" w:w="850"/>
+            <w:vAlign w:val="top"/>
+          </w:tcPr>
+          <w:p>
+            <w:pPr>
+              <w:spacing w:after="20" w:line="252" w:lineRule="auto"/>
+              <w:jc w:val="center"/>
+            </w:pPr>
+            <w:r>
+              <w:rPr>
+                <w:b w:val="0"/>
+                <w:i w:val="0"/>
+                <w:sz w:val="16"/>
+              </w:rPr>
+              <w:t>8</w:t>
+            </w:r>
+          </w:p>
+        </w:tc>
+      </w:tr>
+      <w:tr>
+        <w:trPr>
+          <w:cantSplit/>
+        </w:trPr>
+        <w:tc>
+          <w:tcPr>
+            <w:tcW w:type="dxa" w:w="2608"/>
+            <w:vAlign w:val="top"/>
+            <w:shd w:val="clear" w:color="auto" w:fill="FDF0F7"/>
+          </w:tcPr>
+          <w:p>
+            <w:pPr>
+              <w:spacing w:after="20" w:line="252" w:lineRule="auto"/>
+            </w:pPr>
+            <w:r>
+              <w:rPr>
+                <w:b w:val="0"/>
+                <w:i w:val="0"/>
+                <w:sz w:val="16"/>
+              </w:rPr>
+              <w:t>PaymentList.test.tsx</w:t>
+            </w:r>
+          </w:p>
+        </w:tc>
+        <w:tc>
+          <w:tcPr>
+            <w:tcW w:type="dxa" w:w="5329"/>
+            <w:vAlign w:val="top"/>
+            <w:shd w:val="clear" w:color="auto" w:fill="FDF0F7"/>
+          </w:tcPr>
+          <w:p>
+            <w:pPr>
+              <w:spacing w:after="20" w:line="252" w:lineRule="auto"/>
+            </w:pPr>
+            <w:r>
+              <w:rPr>
+                <w:b w:val="0"/>
+                <w:i w:val="0"/>
+                <w:sz w:val="16"/>
+              </w:rPr>
+              <w:t>Payment list filtered by the status in the URL</w:t>
+            </w:r>
+          </w:p>
+        </w:tc>
+        <w:tc>
+          <w:tcPr>
+            <w:tcW w:type="dxa" w:w="850"/>
+            <w:vAlign w:val="top"/>
+            <w:shd w:val="clear" w:color="auto" w:fill="FDF0F7"/>
+          </w:tcPr>
+          <w:p>
+            <w:pPr>
+              <w:spacing w:after="20" w:line="252" w:lineRule="auto"/>
+              <w:jc w:val="center"/>
+            </w:pPr>
+            <w:r>
+              <w:rPr>
+                <w:b w:val="0"/>
+                <w:i w:val="0"/>
+                <w:sz w:val="16"/>
+              </w:rPr>
+              <w:t>3</w:t>
+            </w:r>
+          </w:p>
+        </w:tc>
+        <w:tc>
+          <w:tcPr>
+            <w:tcW w:type="dxa" w:w="850"/>
+            <w:vAlign w:val="top"/>
+            <w:shd w:val="clear" w:color="auto" w:fill="FDF0F7"/>
+          </w:tcPr>
+          <w:p>
+            <w:pPr>
+              <w:spacing w:after="20" w:line="252" w:lineRule="auto"/>
+              <w:jc w:val="center"/>
+            </w:pPr>
+            <w:r>
+              <w:rPr>
+                <w:b w:val="0"/>
+                <w:i w:val="0"/>
+                <w:sz w:val="16"/>
+              </w:rPr>
+              <w:t>3</w:t>
+            </w:r>
+          </w:p>
+        </w:tc>
+      </w:tr>
+      <w:tr>
+        <w:trPr>
+          <w:cantSplit/>
+        </w:trPr>
+        <w:tc>
+          <w:tcPr>
+            <w:tcW w:type="dxa" w:w="2608"/>
+            <w:vAlign w:val="top"/>
+          </w:tcPr>
+          <w:p>
+            <w:pPr>
+              <w:spacing w:after="20" w:line="252" w:lineRule="auto"/>
+            </w:pPr>
+            <w:r>
+              <w:rPr>
+                <w:b w:val="0"/>
+                <w:i w:val="0"/>
+                <w:sz w:val="16"/>
+              </w:rPr>
               <w:t>options.test.ts</w:t>
             </w:r>
           </w:p>
@@ -7667,6 +7837,93 @@
                 <w:sz w:val="16"/>
               </w:rPr>
               <w:t>4</w:t>
+            </w:r>
+          </w:p>
+        </w:tc>
+      </w:tr>
+      <w:tr>
+        <w:trPr>
+          <w:cantSplit/>
+        </w:trPr>
+        <w:tc>
+          <w:tcPr>
+            <w:tcW w:type="dxa" w:w="2608"/>
+            <w:vAlign w:val="top"/>
+            <w:shd w:val="clear" w:color="auto" w:fill="FDF0F7"/>
+          </w:tcPr>
+          <w:p>
+            <w:pPr>
+              <w:spacing w:after="20" w:line="252" w:lineRule="auto"/>
+            </w:pPr>
+            <w:r>
+              <w:rPr>
+                <w:b w:val="0"/>
+                <w:i w:val="0"/>
+                <w:sz w:val="16"/>
+              </w:rPr>
+              <w:t>LoginPage.test.tsx</w:t>
+            </w:r>
+          </w:p>
+        </w:tc>
+        <w:tc>
+          <w:tcPr>
+            <w:tcW w:type="dxa" w:w="5329"/>
+            <w:vAlign w:val="top"/>
+            <w:shd w:val="clear" w:color="auto" w:fill="FDF0F7"/>
+          </w:tcPr>
+          <w:p>
+            <w:pPr>
+              <w:spacing w:after="20" w:line="252" w:lineRule="auto"/>
+            </w:pPr>
+            <w:r>
+              <w:rPr>
+                <w:b w:val="0"/>
+                <w:i w:val="0"/>
+                <w:sz w:val="16"/>
+              </w:rPr>
+              <w:t>Sign-in form: validation, forced password change, rejected credentials, ended session</w:t>
+            </w:r>
+          </w:p>
+        </w:tc>
+        <w:tc>
+          <w:tcPr>
+            <w:tcW w:type="dxa" w:w="850"/>
+            <w:vAlign w:val="top"/>
+            <w:shd w:val="clear" w:color="auto" w:fill="FDF0F7"/>
+          </w:tcPr>
+          <w:p>
+            <w:pPr>
+              <w:spacing w:after="20" w:line="252" w:lineRule="auto"/>
+              <w:jc w:val="center"/>
+            </w:pPr>
+            <w:r>
+              <w:rPr>
+                <w:b w:val="0"/>
+                <w:i w:val="0"/>
+                <w:sz w:val="16"/>
+              </w:rPr>
+              <w:t>7</w:t>
+            </w:r>
+          </w:p>
+        </w:tc>
+        <w:tc>
+          <w:tcPr>
+            <w:tcW w:type="dxa" w:w="850"/>
+            <w:vAlign w:val="top"/>
+            <w:shd w:val="clear" w:color="auto" w:fill="FDF0F7"/>
+          </w:tcPr>
+          <w:p>
+            <w:pPr>
+              <w:spacing w:after="20" w:line="252" w:lineRule="auto"/>
+              <w:jc w:val="center"/>
+            </w:pPr>
+            <w:r>
+              <w:rPr>
+                <w:b w:val="0"/>
+                <w:i w:val="0"/>
+                <w:sz w:val="16"/>
+              </w:rPr>
+              <w:t>7</w:t>
             </w:r>
           </w:p>
         </w:tc>
@@ -12889,7 +13146,7 @@
                 <w:i w:val="0"/>
                 <w:sz w:val="17"/>
               </w:rPr>
-              <w:t>16</w:t>
+              <w:t>19</w:t>
             </w:r>
           </w:p>
         </w:tc>
@@ -20264,7 +20521,7 @@
                 <w:i w:val="0"/>
                 <w:sz w:val="15"/>
               </w:rPr>
-              <w:t>does not end the session when the login itself is rejected</w:t>
+              <w:t>does not treat the session probe as a session that ended</w:t>
             </w:r>
           </w:p>
         </w:tc>
@@ -20327,7 +20584,7 @@
                 <w:i w:val="0"/>
                 <w:sz w:val="15"/>
               </w:rPr>
-              <w:t>stops notifying a listener after it unsubscribes</w:t>
+              <w:t>does not end the session when the login itself is rejected</w:t>
             </w:r>
           </w:p>
         </w:tc>
@@ -20391,7 +20648,7 @@
                 <w:i w:val="0"/>
                 <w:sz w:val="15"/>
               </w:rPr>
-              <w:t>does not end the session on other client errors</w:t>
+              <w:t>stops notifying a listener after it unsubscribes</w:t>
             </w:r>
           </w:p>
         </w:tc>
@@ -20454,7 +20711,7 @@
                 <w:i w:val="0"/>
                 <w:sz w:val="15"/>
               </w:rPr>
-              <w:t>raises an ApiError when the file cannot be downloaded</w:t>
+              <w:t>does not end the session on other client errors</w:t>
             </w:r>
           </w:p>
         </w:tc>
@@ -20498,7 +20755,7 @@
                 <w:i w:val="0"/>
                 <w:sz w:val="15"/>
               </w:rPr>
-              <w:t>ErrorAlert.test.tsx</w:t>
+              <w:t>client.test.ts</w:t>
             </w:r>
           </w:p>
         </w:tc>
@@ -20518,7 +20775,7 @@
                 <w:i w:val="0"/>
                 <w:sz w:val="15"/>
               </w:rPr>
-              <w:t>renders nothing when there is no error</w:t>
+              <w:t>raises an ApiError when the file cannot be downloaded</w:t>
             </w:r>
           </w:p>
         </w:tc>
@@ -20581,7 +20838,7 @@
                 <w:i w:val="0"/>
                 <w:sz w:val="15"/>
               </w:rPr>
-              <w:t>shows the API message and each validation detail</w:t>
+              <w:t>renders nothing when there is no error</w:t>
             </w:r>
           </w:p>
         </w:tc>
@@ -20645,7 +20902,7 @@
                 <w:i w:val="0"/>
                 <w:sz w:val="15"/>
               </w:rPr>
-              <w:t>shows the support reference for server errors only</w:t>
+              <w:t>shows the API message and each validation detail</w:t>
             </w:r>
           </w:p>
         </w:tc>
@@ -20708,7 +20965,7 @@
                 <w:i w:val="0"/>
                 <w:sz w:val="15"/>
               </w:rPr>
-              <w:t>falls back to a generic message for unexpected errors</w:t>
+              <w:t>shows the support reference for server errors only</w:t>
             </w:r>
           </w:p>
         </w:tc>
@@ -20752,7 +21009,7 @@
                 <w:i w:val="0"/>
                 <w:sz w:val="15"/>
               </w:rPr>
-              <w:t>Money.test.tsx</w:t>
+              <w:t>ErrorAlert.test.tsx</w:t>
             </w:r>
           </w:p>
         </w:tc>
@@ -20772,7 +21029,7 @@
                 <w:i w:val="0"/>
                 <w:sz w:val="15"/>
               </w:rPr>
-              <w:t>shows the formatted amount</w:t>
+              <w:t>falls back to a generic message for unexpected errors</w:t>
             </w:r>
           </w:p>
         </w:tc>
@@ -20816,7 +21073,7 @@
                 <w:i w:val="0"/>
                 <w:sz w:val="15"/>
               </w:rPr>
-              <w:t>Money.test.tsx</w:t>
+              <w:t>FieldGrid.test.tsx</w:t>
             </w:r>
           </w:p>
         </w:tc>
@@ -20835,7 +21092,7 @@
                 <w:i w:val="0"/>
                 <w:sz w:val="15"/>
               </w:rPr>
-              <w:t>can be emphasised</w:t>
+              <w:t>pairs each label with its value</w:t>
             </w:r>
           </w:p>
         </w:tc>
@@ -20879,7 +21136,7 @@
                 <w:i w:val="0"/>
                 <w:sz w:val="15"/>
               </w:rPr>
-              <w:t>RequirePermission.test.tsx</w:t>
+              <w:t>FieldGrid.test.tsx</w:t>
             </w:r>
           </w:p>
         </w:tc>
@@ -20899,7 +21156,7 @@
                 <w:i w:val="0"/>
                 <w:sz w:val="15"/>
               </w:rPr>
-              <w:t>renders the page when the user holds the permission</w:t>
+              <w:t>shows a dash for empty values and skips conditional items</w:t>
             </w:r>
           </w:p>
         </w:tc>
@@ -20943,7 +21200,7 @@
                 <w:i w:val="0"/>
                 <w:sz w:val="15"/>
               </w:rPr>
-              <w:t>RequirePermission.test.tsx</w:t>
+              <w:t>FieldGrid.test.tsx</w:t>
             </w:r>
           </w:p>
         </w:tc>
@@ -20962,7 +21219,7 @@
                 <w:i w:val="0"/>
                 <w:sz w:val="15"/>
               </w:rPr>
-              <w:t>shows the not-authorised page when the permission is missing</w:t>
+              <w:t>widens full-width fields across the grid</w:t>
             </w:r>
           </w:p>
         </w:tc>
@@ -21006,7 +21263,7 @@
                 <w:i w:val="0"/>
                 <w:sz w:val="15"/>
               </w:rPr>
-              <w:t>StatusTag.test.tsx</w:t>
+              <w:t>Money.test.tsx</w:t>
             </w:r>
           </w:p>
         </w:tc>
@@ -21026,7 +21283,7 @@
                 <w:i w:val="0"/>
                 <w:sz w:val="15"/>
               </w:rPr>
-              <w:t>shows the humanised status with its colour</w:t>
+              <w:t>shows the formatted amount</w:t>
             </w:r>
           </w:p>
         </w:tc>
@@ -21070,7 +21327,7 @@
                 <w:i w:val="0"/>
                 <w:sz w:val="15"/>
               </w:rPr>
-              <w:t>StatusTag.test.tsx</w:t>
+              <w:t>Money.test.tsx</w:t>
             </w:r>
           </w:p>
         </w:tc>
@@ -21089,7 +21346,7 @@
                 <w:i w:val="0"/>
                 <w:sz w:val="15"/>
               </w:rPr>
-              <w:t>prefers an explicit label</w:t>
+              <w:t>can be emphasised</w:t>
             </w:r>
           </w:p>
         </w:tc>
@@ -21133,7 +21390,7 @@
                 <w:i w:val="0"/>
                 <w:sz w:val="15"/>
               </w:rPr>
-              <w:t>StatusTag.test.tsx</w:t>
+              <w:t>PageHeader.test.tsx</w:t>
             </w:r>
           </w:p>
         </w:tc>
@@ -21153,7 +21410,7 @@
                 <w:i w:val="0"/>
                 <w:sz w:val="15"/>
               </w:rPr>
-              <w:t>renders nothing without a status</w:t>
+              <w:t>shows the breadcrumb, title, status tags and key facts</w:t>
             </w:r>
           </w:p>
         </w:tc>
@@ -21197,7 +21454,7 @@
                 <w:i w:val="0"/>
                 <w:sz w:val="15"/>
               </w:rPr>
-              <w:t>menus.test.ts</w:t>
+              <w:t>PageHeader.test.tsx</w:t>
             </w:r>
           </w:p>
         </w:tc>
@@ -21216,7 +21473,7 @@
                 <w:i w:val="0"/>
                 <w:sz w:val="15"/>
               </w:rPr>
-              <w:t>highlights the dashboard only on the module root</w:t>
+              <w:t>leaves out the facts row when there are none</w:t>
             </w:r>
           </w:p>
         </w:tc>
@@ -21260,7 +21517,7 @@
                 <w:i w:val="0"/>
                 <w:sz w:val="15"/>
               </w:rPr>
-              <w:t>menus.test.ts</w:t>
+              <w:t>RequirePermission.test.tsx</w:t>
             </w:r>
           </w:p>
         </w:tc>
@@ -21280,7 +21537,7 @@
                 <w:i w:val="0"/>
                 <w:sz w:val="15"/>
               </w:rPr>
-              <w:t>highlights nothing on pages without a menu entry</w:t>
+              <w:t>renders the page when the user holds the permission</w:t>
             </w:r>
           </w:p>
         </w:tc>
@@ -21324,7 +21581,7 @@
                 <w:i w:val="0"/>
                 <w:sz w:val="15"/>
               </w:rPr>
-              <w:t>menus.test.ts</w:t>
+              <w:t>RequirePermission.test.tsx</w:t>
             </w:r>
           </w:p>
         </w:tc>
@@ -21343,7 +21600,7 @@
                 <w:i w:val="0"/>
                 <w:sz w:val="15"/>
               </w:rPr>
-              <w:t>highlights the entry whose path is a parent of the current page</w:t>
+              <w:t>shows the not-authorised page when the permission is missing</w:t>
             </w:r>
           </w:p>
         </w:tc>
@@ -21387,7 +21644,7 @@
                 <w:i w:val="0"/>
                 <w:sz w:val="15"/>
               </w:rPr>
-              <w:t>menus.test.ts</w:t>
+              <w:t>StatusTag.test.tsx</w:t>
             </w:r>
           </w:p>
         </w:tc>
@@ -21407,7 +21664,7 @@
                 <w:i w:val="0"/>
                 <w:sz w:val="15"/>
               </w:rPr>
-              <w:t>prefers the longest matching entry</w:t>
+              <w:t>shows the humanised status with its colour</w:t>
             </w:r>
           </w:p>
         </w:tc>
@@ -21451,7 +21708,7 @@
                 <w:i w:val="0"/>
                 <w:sz w:val="15"/>
               </w:rPr>
-              <w:t>menus.test.ts</w:t>
+              <w:t>StatusTag.test.tsx</w:t>
             </w:r>
           </w:p>
         </w:tc>
@@ -21470,7 +21727,7 @@
                 <w:i w:val="0"/>
                 <w:sz w:val="15"/>
               </w:rPr>
-              <w:t>does not match entries that merely share a prefix</w:t>
+              <w:t>prefers an explicit label</w:t>
             </w:r>
           </w:p>
         </w:tc>
@@ -21514,7 +21771,7 @@
                 <w:i w:val="0"/>
                 <w:sz w:val="15"/>
               </w:rPr>
-              <w:t>menus.test.ts</w:t>
+              <w:t>StatusTag.test.tsx</w:t>
             </w:r>
           </w:p>
         </w:tc>
@@ -21534,7 +21791,7 @@
                 <w:i w:val="0"/>
                 <w:sz w:val="15"/>
               </w:rPr>
-              <w:t>ignores a trailing slash</w:t>
+              <w:t>uses the tone for chips that are not stored statuses</w:t>
             </w:r>
           </w:p>
         </w:tc>
@@ -21578,7 +21835,7 @@
                 <w:i w:val="0"/>
                 <w:sz w:val="15"/>
               </w:rPr>
-              <w:t>format.test.ts</w:t>
+              <w:t>StatusTag.test.tsx</w:t>
             </w:r>
           </w:p>
         </w:tc>
@@ -21597,7 +21854,7 @@
                 <w:i w:val="0"/>
                 <w:sz w:val="15"/>
               </w:rPr>
-              <w:t>formats amounts in Brunei dollars with two decimals and thousands separators</w:t>
+              <w:t>renders nothing without a status</w:t>
             </w:r>
           </w:p>
         </w:tc>
@@ -21641,7 +21898,7 @@
                 <w:i w:val="0"/>
                 <w:sz w:val="15"/>
               </w:rPr>
-              <w:t>format.test.ts</w:t>
+              <w:t>UserMenu.test.ts</w:t>
             </w:r>
           </w:p>
         </w:tc>
@@ -21661,7 +21918,7 @@
                 <w:i w:val="0"/>
                 <w:sz w:val="15"/>
               </w:rPr>
-              <w:t>rounds to the nearest cent and keeps zero as an amount</w:t>
+              <w:t>uses the first two given names</w:t>
             </w:r>
           </w:p>
         </w:tc>
@@ -21705,7 +21962,7 @@
                 <w:i w:val="0"/>
                 <w:sz w:val="15"/>
               </w:rPr>
-              <w:t>format.test.ts</w:t>
+              <w:t>UserMenu.test.ts</w:t>
             </w:r>
           </w:p>
         </w:tc>
@@ -21724,7 +21981,7 @@
                 <w:i w:val="0"/>
                 <w:sz w:val="15"/>
               </w:rPr>
-              <w:t>shows a dash when there is no amount</w:t>
+              <w:t>skips honorifics and patronymic particles</w:t>
             </w:r>
           </w:p>
         </w:tc>
@@ -21768,7 +22025,7 @@
                 <w:i w:val="0"/>
                 <w:sz w:val="15"/>
               </w:rPr>
-              <w:t>format.test.ts</w:t>
+              <w:t>menus.test.ts</w:t>
             </w:r>
           </w:p>
         </w:tc>
@@ -21788,7 +22045,7 @@
                 <w:i w:val="0"/>
                 <w:sz w:val="15"/>
               </w:rPr>
-              <w:t>groups thousands and shows a dash when there is no value</w:t>
+              <w:t>highlights the dashboard only on the module root</w:t>
             </w:r>
           </w:p>
         </w:tc>
@@ -21832,7 +22089,7 @@
                 <w:i w:val="0"/>
                 <w:sz w:val="15"/>
               </w:rPr>
-              <w:t>format.test.ts</w:t>
+              <w:t>menus.test.ts</w:t>
             </w:r>
           </w:p>
         </w:tc>
@@ -21851,7 +22108,7 @@
                 <w:i w:val="0"/>
                 <w:sz w:val="15"/>
               </w:rPr>
-              <w:t>formats a calendar date as day, short month and year</w:t>
+              <w:t>highlights nothing on pages without a menu entry</w:t>
             </w:r>
           </w:p>
         </w:tc>
@@ -21895,7 +22152,7 @@
                 <w:i w:val="0"/>
                 <w:sz w:val="15"/>
               </w:rPr>
-              <w:t>format.test.ts</w:t>
+              <w:t>menus.test.ts</w:t>
             </w:r>
           </w:p>
         </w:tc>
@@ -21915,7 +22172,7 @@
                 <w:i w:val="0"/>
                 <w:sz w:val="15"/>
               </w:rPr>
-              <w:t>formats a local timestamp with a 24-hour time</w:t>
+              <w:t>highlights the entry whose path is a parent of the current page</w:t>
             </w:r>
           </w:p>
         </w:tc>
@@ -21959,7 +22216,7 @@
                 <w:i w:val="0"/>
                 <w:sz w:val="15"/>
               </w:rPr>
-              <w:t>format.test.ts</w:t>
+              <w:t>menus.test.ts</w:t>
             </w:r>
           </w:p>
         </w:tc>
@@ -21978,7 +22235,7 @@
                 <w:i w:val="0"/>
                 <w:sz w:val="15"/>
               </w:rPr>
-              <w:t>shows a dash for missing dates</w:t>
+              <w:t>prefers the longest matching entry</w:t>
             </w:r>
           </w:p>
         </w:tc>
@@ -22022,7 +22279,7 @@
                 <w:i w:val="0"/>
                 <w:sz w:val="15"/>
               </w:rPr>
-              <w:t>format.test.ts</w:t>
+              <w:t>menus.test.ts</w:t>
             </w:r>
           </w:p>
         </w:tc>
@@ -22042,7 +22299,7 @@
                 <w:i w:val="0"/>
                 <w:sz w:val="15"/>
               </w:rPr>
-              <w:t>turns an enum code into sentence case</w:t>
+              <w:t>does not match entries that merely share a prefix</w:t>
             </w:r>
           </w:p>
         </w:tc>
@@ -22086,7 +22343,7 @@
                 <w:i w:val="0"/>
                 <w:sz w:val="15"/>
               </w:rPr>
-              <w:t>format.test.ts</w:t>
+              <w:t>menus.test.ts</w:t>
             </w:r>
           </w:p>
         </w:tc>
@@ -22105,7 +22362,7 @@
                 <w:i w:val="0"/>
                 <w:sz w:val="15"/>
               </w:rPr>
-              <w:t>shows a dash for an empty value</w:t>
+              <w:t>ignores a trailing slash</w:t>
             </w:r>
           </w:p>
         </w:tc>
@@ -22149,7 +22406,7 @@
                 <w:i w:val="0"/>
                 <w:sz w:val="15"/>
               </w:rPr>
-              <w:t>format.test.ts</w:t>
+              <w:t>menus.test.ts</w:t>
             </w:r>
           </w:p>
         </w:tc>
@@ -22169,7 +22426,7 @@
                 <w:i w:val="0"/>
                 <w:sz w:val="15"/>
               </w:rPr>
-              <w:t>splits camel-case keys into a sentence-case label</w:t>
+              <w:t>returns the group holding the highlighted entry</w:t>
             </w:r>
           </w:p>
         </w:tc>
@@ -22213,7 +22470,7 @@
                 <w:i w:val="0"/>
                 <w:sz w:val="15"/>
               </w:rPr>
-              <w:t>format.test.ts</w:t>
+              <w:t>menus.test.ts</w:t>
             </w:r>
           </w:p>
         </w:tc>
@@ -22232,7 +22489,7 @@
                 <w:i w:val="0"/>
                 <w:sz w:val="15"/>
               </w:rPr>
-              <w:t>uses bytes, kilobytes or megabytes depending on size</w:t>
+              <w:t>returns nothing for top-level entries and pages outside the menu</w:t>
             </w:r>
           </w:p>
         </w:tc>
@@ -22276,7 +22533,7 @@
                 <w:i w:val="0"/>
                 <w:sz w:val="15"/>
               </w:rPr>
-              <w:t>permissions.test.ts</w:t>
+              <w:t>format.test.ts</w:t>
             </w:r>
           </w:p>
         </w:tc>
@@ -22296,7 +22553,7 @@
                 <w:i w:val="0"/>
                 <w:sz w:val="15"/>
               </w:rPr>
-              <w:t>are unique</w:t>
+              <w:t>formats amounts in Brunei dollars with two decimals and thousands separators</w:t>
             </w:r>
           </w:p>
         </w:tc>
@@ -22340,7 +22597,7 @@
                 <w:i w:val="0"/>
                 <w:sz w:val="15"/>
               </w:rPr>
-              <w:t>permissions.test.ts</w:t>
+              <w:t>format.test.ts</w:t>
             </w:r>
           </w:p>
         </w:tc>
@@ -22359,7 +22616,7 @@
                 <w:i w:val="0"/>
                 <w:sz w:val="15"/>
               </w:rPr>
-              <w:t>use the portal or back-office prefix matching their key</w:t>
+              <w:t>rounds to the nearest cent and keeps zero as an amount</w:t>
             </w:r>
           </w:p>
         </w:tc>
@@ -22403,7 +22660,7 @@
                 <w:i w:val="0"/>
                 <w:sz w:val="15"/>
               </w:rPr>
-              <w:t>permissions.test.ts</w:t>
+              <w:t>format.test.ts</w:t>
             </w:r>
           </w:p>
         </w:tc>
@@ -22423,7 +22680,7 @@
                 <w:i w:val="0"/>
                 <w:sz w:val="15"/>
               </w:rPr>
-              <w:t>group every approval permission and nothing else</w:t>
+              <w:t>shows a dash when there is no amount</w:t>
             </w:r>
           </w:p>
         </w:tc>
@@ -22467,7 +22724,7 @@
                 <w:i w:val="0"/>
                 <w:sz w:val="15"/>
               </w:rPr>
-              <w:t>status.test.ts</w:t>
+              <w:t>format.test.ts</w:t>
             </w:r>
           </w:p>
         </w:tc>
@@ -22486,7 +22743,7 @@
                 <w:i w:val="0"/>
                 <w:sz w:val="15"/>
               </w:rPr>
-              <w:t>maps statuses to the tag colour of their stage</w:t>
+              <w:t>groups thousands and shows a dash when there is no value</w:t>
             </w:r>
           </w:p>
         </w:tc>
@@ -22530,7 +22787,7 @@
                 <w:i w:val="0"/>
                 <w:sz w:val="15"/>
               </w:rPr>
-              <w:t>status.test.ts</w:t>
+              <w:t>format.test.ts</w:t>
             </w:r>
           </w:p>
         </w:tc>
@@ -22550,7 +22807,7 @@
                 <w:i w:val="0"/>
                 <w:sz w:val="15"/>
               </w:rPr>
-              <w:t>falls back to the default colour for unknown or missing statuses</w:t>
+              <w:t>formats a calendar date as day, short month and year</w:t>
             </w:r>
           </w:p>
         </w:tc>
@@ -22594,7 +22851,7 @@
                 <w:i w:val="0"/>
                 <w:sz w:val="15"/>
               </w:rPr>
-              <w:t>LoginPage.test.tsx</w:t>
+              <w:t>format.test.ts</w:t>
             </w:r>
           </w:p>
         </w:tc>
@@ -22613,7 +22870,7 @@
                 <w:i w:val="0"/>
                 <w:sz w:val="15"/>
               </w:rPr>
-              <w:t>renders the username and password fields</w:t>
+              <w:t>formats a local timestamp with a 24-hour time</w:t>
             </w:r>
           </w:p>
         </w:tc>
@@ -22657,7 +22914,7 @@
                 <w:i w:val="0"/>
                 <w:sz w:val="15"/>
               </w:rPr>
-              <w:t>LoginPage.test.tsx</w:t>
+              <w:t>format.test.ts</w:t>
             </w:r>
           </w:p>
         </w:tc>
@@ -22677,7 +22934,7 @@
                 <w:i w:val="0"/>
                 <w:sz w:val="15"/>
               </w:rPr>
-              <w:t>asks for both fields when submitted empty</w:t>
+              <w:t>shows a dash for missing dates</w:t>
             </w:r>
           </w:p>
         </w:tc>
@@ -22721,7 +22978,7 @@
                 <w:i w:val="0"/>
                 <w:sz w:val="15"/>
               </w:rPr>
-              <w:t>LoginPage.test.tsx</w:t>
+              <w:t>format.test.ts</w:t>
             </w:r>
           </w:p>
         </w:tc>
@@ -22740,7 +22997,7 @@
                 <w:i w:val="0"/>
                 <w:sz w:val="15"/>
               </w:rPr>
-              <w:t>signs in with the typed credentials and opens the home page</w:t>
+              <w:t>turns an enum code into sentence case</w:t>
             </w:r>
           </w:p>
         </w:tc>
@@ -22784,7 +23041,7 @@
                 <w:i w:val="0"/>
                 <w:sz w:val="15"/>
               </w:rPr>
-              <w:t>LoginPage.test.tsx</w:t>
+              <w:t>format.test.ts</w:t>
             </w:r>
           </w:p>
         </w:tc>
@@ -22804,7 +23061,7 @@
                 <w:i w:val="0"/>
                 <w:sz w:val="15"/>
               </w:rPr>
-              <w:t>sends users who must change their password to the change-password page</w:t>
+              <w:t>shows a dash for an empty value</w:t>
             </w:r>
           </w:p>
         </w:tc>
@@ -22848,7 +23105,7 @@
                 <w:i w:val="0"/>
                 <w:sz w:val="15"/>
               </w:rPr>
-              <w:t>LoginPage.test.tsx</w:t>
+              <w:t>format.test.ts</w:t>
             </w:r>
           </w:p>
         </w:tc>
@@ -22867,7 +23124,7 @@
                 <w:i w:val="0"/>
                 <w:sz w:val="15"/>
               </w:rPr>
-              <w:t>shows the error returned for rejected credentials</w:t>
+              <w:t>splits camel-case keys into a sentence-case label</w:t>
             </w:r>
           </w:p>
         </w:tc>
@@ -22911,7 +23168,7 @@
                 <w:i w:val="0"/>
                 <w:sz w:val="15"/>
               </w:rPr>
-              <w:t>LoginPage.test.tsx</w:t>
+              <w:t>format.test.ts</w:t>
             </w:r>
           </w:p>
         </w:tc>
@@ -22931,7 +23188,7 @@
                 <w:i w:val="0"/>
                 <w:sz w:val="15"/>
               </w:rPr>
-              <w:t>explains that the previous session ended</w:t>
+              <w:t>uses bytes, kilobytes or megabytes depending on size</w:t>
             </w:r>
           </w:p>
         </w:tc>
@@ -22975,7 +23232,7 @@
                 <w:i w:val="0"/>
                 <w:sz w:val="15"/>
               </w:rPr>
-              <w:t>CellText.test.tsx</w:t>
+              <w:t>permissions.test.ts</w:t>
             </w:r>
           </w:p>
         </w:tc>
@@ -22994,7 +23251,7 @@
                 <w:i w:val="0"/>
                 <w:sz w:val="15"/>
               </w:rPr>
-              <w:t>shows the text within the given width</w:t>
+              <w:t>are unique</w:t>
             </w:r>
           </w:p>
         </w:tc>
@@ -23038,7 +23295,7 @@
                 <w:i w:val="0"/>
                 <w:sz w:val="15"/>
               </w:rPr>
-              <w:t>CellText.test.tsx</w:t>
+              <w:t>permissions.test.ts</w:t>
             </w:r>
           </w:p>
         </w:tc>
@@ -23058,7 +23315,7 @@
                 <w:i w:val="0"/>
                 <w:sz w:val="15"/>
               </w:rPr>
-              <w:t>shows a dash when there is no text</w:t>
+              <w:t>use the portal or back-office prefix matching their key</w:t>
             </w:r>
           </w:p>
         </w:tc>
@@ -23102,7 +23359,7 @@
                 <w:i w:val="0"/>
                 <w:sz w:val="15"/>
               </w:rPr>
-              <w:t>links.test.ts</w:t>
+              <w:t>permissions.test.ts</w:t>
             </w:r>
           </w:p>
         </w:tc>
@@ -23121,7 +23378,7 @@
                 <w:i w:val="0"/>
                 <w:sz w:val="15"/>
               </w:rPr>
-              <w:t>links to the record page regardless of the entity type spelling</w:t>
+              <w:t>group every approval permission and nothing else</w:t>
             </w:r>
           </w:p>
         </w:tc>
@@ -23165,7 +23422,7 @@
                 <w:i w:val="0"/>
                 <w:sz w:val="15"/>
               </w:rPr>
-              <w:t>links.test.ts</w:t>
+              <w:t>status.test.ts</w:t>
             </w:r>
           </w:p>
         </w:tc>
@@ -23185,7 +23442,7 @@
                 <w:i w:val="0"/>
                 <w:sz w:val="15"/>
               </w:rPr>
-              <w:t>uses the portal routes for portal users</w:t>
+              <w:t>uses one colour per semantic group</w:t>
             </w:r>
           </w:p>
         </w:tc>
@@ -23229,7 +23486,7 @@
                 <w:i w:val="0"/>
                 <w:sz w:val="15"/>
               </w:rPr>
-              <w:t>links.test.ts</w:t>
+              <w:t>status.test.ts</w:t>
             </w:r>
           </w:p>
         </w:tc>
@@ -23248,7 +23505,7 @@
                 <w:i w:val="0"/>
                 <w:sz w:val="15"/>
               </w:rPr>
-              <w:t>returns null when the audience has no page for the record or the id is missing</w:t>
+              <w:t>exposes the semantic tone</w:t>
             </w:r>
           </w:p>
         </w:tc>
@@ -23292,7 +23549,7 @@
                 <w:i w:val="0"/>
                 <w:sz w:val="15"/>
               </w:rPr>
-              <w:t>links.test.ts</w:t>
+              <w:t>status.test.ts</w:t>
             </w:r>
           </w:p>
         </w:tc>
@@ -23312,7 +23569,7 @@
                 <w:i w:val="0"/>
                 <w:sz w:val="15"/>
               </w:rPr>
-              <w:t>keeps links that already point into a module</w:t>
+              <w:t>falls back to the default colour for unknown or missing statuses</w:t>
             </w:r>
           </w:p>
         </w:tc>
@@ -23356,7 +23613,7 @@
                 <w:i w:val="0"/>
                 <w:sz w:val="15"/>
               </w:rPr>
-              <w:t>links.test.ts</w:t>
+              <w:t>CellText.test.tsx</w:t>
             </w:r>
           </w:p>
         </w:tc>
@@ -23375,7 +23632,7 @@
                 <w:i w:val="0"/>
                 <w:sz w:val="15"/>
               </w:rPr>
-              <w:t>prefixes audience-neutral links with the user module</w:t>
+              <w:t>shows the text within the given width</w:t>
             </w:r>
           </w:p>
         </w:tc>
@@ -23419,7 +23676,7 @@
                 <w:i w:val="0"/>
                 <w:sz w:val="15"/>
               </w:rPr>
-              <w:t>values.test.ts</w:t>
+              <w:t>CellText.test.tsx</w:t>
             </w:r>
           </w:p>
         </w:tc>
@@ -23439,7 +23696,7 @@
                 <w:i w:val="0"/>
                 <w:sz w:val="15"/>
               </w:rPr>
-              <w:t>hides optimistic-lock versions and encrypted or hashed values only</w:t>
+              <w:t>shows a dash when there is no text</w:t>
             </w:r>
           </w:p>
         </w:tc>
@@ -23483,7 +23740,7 @@
                 <w:i w:val="0"/>
                 <w:sz w:val="15"/>
               </w:rPr>
-              <w:t>values.test.ts</w:t>
+              <w:t>links.test.ts</w:t>
             </w:r>
           </w:p>
         </w:tc>
@@ -23502,7 +23759,7 @@
                 <w:i w:val="0"/>
                 <w:sz w:val="15"/>
               </w:rPr>
-              <w:t>uses curated labels where needed and sentence case otherwise</w:t>
+              <w:t>links to the record page regardless of the entity type spelling</w:t>
             </w:r>
           </w:p>
         </w:tc>
@@ -23546,7 +23803,7 @@
                 <w:i w:val="0"/>
                 <w:sz w:val="15"/>
               </w:rPr>
-              <w:t>values.test.ts</w:t>
+              <w:t>links.test.ts</w:t>
             </w:r>
           </w:p>
         </w:tc>
@@ -23566,7 +23823,7 @@
                 <w:i w:val="0"/>
                 <w:sz w:val="15"/>
               </w:rPr>
-              <w:t>accepts plain objects only</w:t>
+              <w:t>uses the portal routes for portal users</w:t>
             </w:r>
           </w:p>
         </w:tc>
@@ -23610,7 +23867,7 @@
                 <w:i w:val="0"/>
                 <w:sz w:val="15"/>
               </w:rPr>
-              <w:t>values.test.ts</w:t>
+              <w:t>links.test.ts</w:t>
             </w:r>
           </w:p>
         </w:tc>
@@ -23629,7 +23886,7 @@
                 <w:i w:val="0"/>
                 <w:sz w:val="15"/>
               </w:rPr>
-              <w:t>shows a dash for empty values and Yes/No for booleans</w:t>
+              <w:t>returns null when the audience has no page for the record or the id is missing</w:t>
             </w:r>
           </w:p>
         </w:tc>
@@ -23673,7 +23930,7 @@
                 <w:i w:val="0"/>
                 <w:sz w:val="15"/>
               </w:rPr>
-              <w:t>values.test.ts</w:t>
+              <w:t>links.test.ts</w:t>
             </w:r>
           </w:p>
         </w:tc>
@@ -23693,7 +23950,7 @@
                 <w:i w:val="0"/>
                 <w:sz w:val="15"/>
               </w:rPr>
-              <w:t>formats numeric values of amount-like keys as money</w:t>
+              <w:t>keeps links that already point into a module</w:t>
             </w:r>
           </w:p>
         </w:tc>
@@ -23737,7 +23994,7 @@
                 <w:i w:val="0"/>
                 <w:sz w:val="15"/>
               </w:rPr>
-              <w:t>values.test.ts</w:t>
+              <w:t>links.test.ts</w:t>
             </w:r>
           </w:p>
         </w:tc>
@@ -23756,7 +24013,7 @@
                 <w:i w:val="0"/>
                 <w:sz w:val="15"/>
               </w:rPr>
-              <w:t>formats ISO dates and timestamps</w:t>
+              <w:t>prefixes audience-neutral links with the user module</w:t>
             </w:r>
           </w:p>
         </w:tc>
@@ -23820,7 +24077,7 @@
                 <w:i w:val="0"/>
                 <w:sz w:val="15"/>
               </w:rPr>
-              <w:t>humanises enum codes that contain underscores or sit under an enum-like key</w:t>
+              <w:t>hides optimistic-lock versions and encrypted or hashed values only</w:t>
             </w:r>
           </w:p>
         </w:tc>
@@ -23883,7 +24140,7 @@
                 <w:i w:val="0"/>
                 <w:sz w:val="15"/>
               </w:rPr>
-              <w:t>serialises nested values as JSON</w:t>
+              <w:t>uses curated labels where needed and sentence case otherwise</w:t>
             </w:r>
           </w:p>
         </w:tc>
@@ -23927,7 +24184,7 @@
                 <w:i w:val="0"/>
                 <w:sz w:val="15"/>
               </w:rPr>
-              <w:t>NomineesEditor.test.ts</w:t>
+              <w:t>values.test.ts</w:t>
             </w:r>
           </w:p>
         </w:tc>
@@ -23947,7 +24204,7 @@
                 <w:i w:val="0"/>
                 <w:sz w:val="15"/>
               </w:rPr>
-              <w:t>starts with a single full-share nominee row when there are no nominees</w:t>
+              <w:t>accepts plain objects only</w:t>
             </w:r>
           </w:p>
         </w:tc>
@@ -23991,7 +24248,7 @@
                 <w:i w:val="0"/>
                 <w:sz w:val="15"/>
               </w:rPr>
-              <w:t>NomineesEditor.test.ts</w:t>
+              <w:t>values.test.ts</w:t>
             </w:r>
           </w:p>
         </w:tc>
@@ -24010,7 +24267,7 @@
                 <w:i w:val="0"/>
                 <w:sz w:val="15"/>
               </w:rPr>
-              <w:t>carries the id and masked ID number of existing nominees</w:t>
+              <w:t>shows a dash for empty values and Yes/No for booleans</w:t>
             </w:r>
           </w:p>
         </w:tc>
@@ -24054,7 +24311,7 @@
                 <w:i w:val="0"/>
                 <w:sz w:val="15"/>
               </w:rPr>
-              <w:t>NomineesEditor.test.ts</w:t>
+              <w:t>values.test.ts</w:t>
             </w:r>
           </w:p>
         </w:tc>
@@ -24074,7 +24331,7 @@
                 <w:i w:val="0"/>
                 <w:sz w:val="15"/>
               </w:rPr>
-              <w:t>converts decimal-string shares to numbers</w:t>
+              <w:t>formats numeric values of amount-like keys as money</w:t>
             </w:r>
           </w:p>
         </w:tc>
@@ -24118,7 +24375,7 @@
                 <w:i w:val="0"/>
                 <w:sz w:val="15"/>
               </w:rPr>
-              <w:t>NomineesEditor.test.ts</w:t>
+              <w:t>values.test.ts</w:t>
             </w:r>
           </w:p>
         </w:tc>
@@ -24137,7 +24394,7 @@
                 <w:i w:val="0"/>
                 <w:sz w:val="15"/>
               </w:rPr>
-              <w:t>returns no inputs when the form has no rows</w:t>
+              <w:t>formats ISO dates and timestamps</w:t>
             </w:r>
           </w:p>
         </w:tc>
@@ -24181,7 +24438,7 @@
                 <w:i w:val="0"/>
                 <w:sz w:val="15"/>
               </w:rPr>
-              <w:t>NomineesEditor.test.ts</w:t>
+              <w:t>values.test.ts</w:t>
             </w:r>
           </w:p>
         </w:tc>
@@ -24201,7 +24458,7 @@
                 <w:i w:val="0"/>
                 <w:sz w:val="15"/>
               </w:rPr>
-              <w:t>keeps the id of an existing nominee and trims the text fields</w:t>
+              <w:t>humanises enum codes that contain underscores or sit under an enum-like key</w:t>
             </w:r>
           </w:p>
         </w:tc>
@@ -24245,7 +24502,7 @@
                 <w:i w:val="0"/>
                 <w:sz w:val="15"/>
               </w:rPr>
-              <w:t>NomineesEditor.test.ts</w:t>
+              <w:t>values.test.ts</w:t>
             </w:r>
           </w:p>
         </w:tc>
@@ -24264,7 +24521,7 @@
                 <w:i w:val="0"/>
                 <w:sz w:val="15"/>
               </w:rPr>
-              <w:t>drops a blank ID number so the stored one is kept</w:t>
+              <w:t>serialises nested values as JSON</w:t>
             </w:r>
           </w:p>
         </w:tc>
@@ -24328,7 +24585,7 @@
                 <w:i w:val="0"/>
                 <w:sz w:val="15"/>
               </w:rPr>
-              <w:t>sends new rows without an id and fills defaults for missing fields</w:t>
+              <w:t>starts with a single full-share nominee row when there are no nominees</w:t>
             </w:r>
           </w:p>
         </w:tc>
@@ -24391,7 +24648,7 @@
                 <w:i w:val="0"/>
                 <w:sz w:val="15"/>
               </w:rPr>
-              <w:t>round-trips existing nominees without changing them</w:t>
+              <w:t>carries the id and masked ID number of existing nominees</w:t>
             </w:r>
           </w:p>
         </w:tc>
@@ -24435,7 +24692,7 @@
                 <w:i w:val="0"/>
                 <w:sz w:val="15"/>
               </w:rPr>
-              <w:t>PaymentList.test.tsx</w:t>
+              <w:t>NomineesEditor.test.ts</w:t>
             </w:r>
           </w:p>
         </w:tc>
@@ -24455,7 +24712,7 @@
                 <w:i w:val="0"/>
                 <w:sz w:val="15"/>
               </w:rPr>
-              <w:t>reads a known payment status</w:t>
+              <w:t>converts decimal-string shares to numbers</w:t>
             </w:r>
           </w:p>
         </w:tc>
@@ -24499,7 +24756,7 @@
                 <w:i w:val="0"/>
                 <w:sz w:val="15"/>
               </w:rPr>
-              <w:t>PaymentList.test.tsx</w:t>
+              <w:t>NomineesEditor.test.ts</w:t>
             </w:r>
           </w:p>
         </w:tc>
@@ -24518,7 +24775,7 @@
                 <w:i w:val="0"/>
                 <w:sz w:val="15"/>
               </w:rPr>
-              <w:t>ignores missing or unknown statuses</w:t>
+              <w:t>returns no inputs when the form has no rows</w:t>
             </w:r>
           </w:p>
         </w:tc>
@@ -24562,7 +24819,7 @@
                 <w:i w:val="0"/>
                 <w:sz w:val="15"/>
               </w:rPr>
-              <w:t>PaymentList.test.tsx</w:t>
+              <w:t>NomineesEditor.test.ts</w:t>
             </w:r>
           </w:p>
         </w:tc>
@@ -24582,7 +24839,7 @@
                 <w:i w:val="0"/>
                 <w:sz w:val="15"/>
               </w:rPr>
-              <w:t>starts filtered by the status in the URL</w:t>
+              <w:t>keeps the id of an existing nominee and trims the text fields</w:t>
             </w:r>
           </w:p>
         </w:tc>
@@ -24626,7 +24883,7 @@
                 <w:i w:val="0"/>
                 <w:sz w:val="15"/>
               </w:rPr>
-              <w:t>options.test.ts</w:t>
+              <w:t>NomineesEditor.test.ts</w:t>
             </w:r>
           </w:p>
         </w:tc>
@@ -24645,7 +24902,7 @@
                 <w:i w:val="0"/>
                 <w:sz w:val="15"/>
               </w:rPr>
-              <w:t>label each code in sentence case</w:t>
+              <w:t>drops a blank ID number so the stored one is kept</w:t>
             </w:r>
           </w:p>
         </w:tc>
@@ -24689,7 +24946,7 @@
                 <w:i w:val="0"/>
                 <w:sz w:val="15"/>
               </w:rPr>
-              <w:t>options.test.ts</w:t>
+              <w:t>NomineesEditor.test.ts</w:t>
             </w:r>
           </w:p>
         </w:tc>
@@ -24709,7 +24966,7 @@
                 <w:i w:val="0"/>
                 <w:sz w:val="15"/>
               </w:rPr>
-              <w:t>uses the policy number once the policy is issued</w:t>
+              <w:t>sends new rows without an id and fills defaults for missing fields</w:t>
             </w:r>
           </w:p>
         </w:tc>
@@ -24753,7 +25010,7 @@
                 <w:i w:val="0"/>
                 <w:sz w:val="15"/>
               </w:rPr>
-              <w:t>options.test.ts</w:t>
+              <w:t>NomineesEditor.test.ts</w:t>
             </w:r>
           </w:p>
         </w:tc>
@@ -24772,7 +25029,7 @@
                 <w:i w:val="0"/>
                 <w:sz w:val="15"/>
               </w:rPr>
-              <w:t>falls back to the quotation number before issuance</w:t>
+              <w:t>round-trips existing nominees without changing them</w:t>
             </w:r>
           </w:p>
         </w:tc>
@@ -24816,6 +25073,197 @@
                 <w:i w:val="0"/>
                 <w:sz w:val="15"/>
               </w:rPr>
+              <w:t>PaymentList.test.tsx</w:t>
+            </w:r>
+          </w:p>
+        </w:tc>
+        <w:tc>
+          <w:tcPr>
+            <w:tcW w:type="dxa" w:w="6123"/>
+            <w:vAlign w:val="top"/>
+            <w:shd w:val="clear" w:color="auto" w:fill="FDF0F7"/>
+          </w:tcPr>
+          <w:p>
+            <w:pPr>
+              <w:spacing w:after="20" w:line="252" w:lineRule="auto"/>
+            </w:pPr>
+            <w:r>
+              <w:rPr>
+                <w:b w:val="0"/>
+                <w:i w:val="0"/>
+                <w:sz w:val="15"/>
+              </w:rPr>
+              <w:t>reads a known payment status</w:t>
+            </w:r>
+          </w:p>
+        </w:tc>
+        <w:tc>
+          <w:tcPr>
+            <w:tcW w:type="dxa" w:w="1020"/>
+            <w:vAlign w:val="top"/>
+            <w:shd w:val="clear" w:color="auto" w:fill="FDF0F7"/>
+          </w:tcPr>
+          <w:p>
+            <w:pPr>
+              <w:spacing w:after="20" w:line="252" w:lineRule="auto"/>
+            </w:pPr>
+            <w:r>
+              <w:rPr>
+                <w:b w:val="0"/>
+                <w:i w:val="0"/>
+                <w:sz w:val="15"/>
+              </w:rPr>
+              <w:t>Passed</w:t>
+            </w:r>
+          </w:p>
+        </w:tc>
+      </w:tr>
+      <w:tr>
+        <w:trPr>
+          <w:cantSplit/>
+        </w:trPr>
+        <w:tc>
+          <w:tcPr>
+            <w:tcW w:type="dxa" w:w="2494"/>
+            <w:vAlign w:val="top"/>
+          </w:tcPr>
+          <w:p>
+            <w:pPr>
+              <w:spacing w:after="20" w:line="252" w:lineRule="auto"/>
+            </w:pPr>
+            <w:r>
+              <w:rPr>
+                <w:b w:val="0"/>
+                <w:i w:val="0"/>
+                <w:sz w:val="15"/>
+              </w:rPr>
+              <w:t>PaymentList.test.tsx</w:t>
+            </w:r>
+          </w:p>
+        </w:tc>
+        <w:tc>
+          <w:tcPr>
+            <w:tcW w:type="dxa" w:w="6123"/>
+            <w:vAlign w:val="top"/>
+          </w:tcPr>
+          <w:p>
+            <w:pPr>
+              <w:spacing w:after="20" w:line="252" w:lineRule="auto"/>
+            </w:pPr>
+            <w:r>
+              <w:rPr>
+                <w:b w:val="0"/>
+                <w:i w:val="0"/>
+                <w:sz w:val="15"/>
+              </w:rPr>
+              <w:t>ignores missing or unknown statuses</w:t>
+            </w:r>
+          </w:p>
+        </w:tc>
+        <w:tc>
+          <w:tcPr>
+            <w:tcW w:type="dxa" w:w="1020"/>
+            <w:vAlign w:val="top"/>
+          </w:tcPr>
+          <w:p>
+            <w:pPr>
+              <w:spacing w:after="20" w:line="252" w:lineRule="auto"/>
+            </w:pPr>
+            <w:r>
+              <w:rPr>
+                <w:b w:val="0"/>
+                <w:i w:val="0"/>
+                <w:sz w:val="15"/>
+              </w:rPr>
+              <w:t>Passed</w:t>
+            </w:r>
+          </w:p>
+        </w:tc>
+      </w:tr>
+      <w:tr>
+        <w:trPr>
+          <w:cantSplit/>
+        </w:trPr>
+        <w:tc>
+          <w:tcPr>
+            <w:tcW w:type="dxa" w:w="2494"/>
+            <w:vAlign w:val="top"/>
+            <w:shd w:val="clear" w:color="auto" w:fill="FDF0F7"/>
+          </w:tcPr>
+          <w:p>
+            <w:pPr>
+              <w:spacing w:after="20" w:line="252" w:lineRule="auto"/>
+            </w:pPr>
+            <w:r>
+              <w:rPr>
+                <w:b w:val="0"/>
+                <w:i w:val="0"/>
+                <w:sz w:val="15"/>
+              </w:rPr>
+              <w:t>PaymentList.test.tsx</w:t>
+            </w:r>
+          </w:p>
+        </w:tc>
+        <w:tc>
+          <w:tcPr>
+            <w:tcW w:type="dxa" w:w="6123"/>
+            <w:vAlign w:val="top"/>
+            <w:shd w:val="clear" w:color="auto" w:fill="FDF0F7"/>
+          </w:tcPr>
+          <w:p>
+            <w:pPr>
+              <w:spacing w:after="20" w:line="252" w:lineRule="auto"/>
+            </w:pPr>
+            <w:r>
+              <w:rPr>
+                <w:b w:val="0"/>
+                <w:i w:val="0"/>
+                <w:sz w:val="15"/>
+              </w:rPr>
+              <w:t>starts filtered by the status in the URL</w:t>
+            </w:r>
+          </w:p>
+        </w:tc>
+        <w:tc>
+          <w:tcPr>
+            <w:tcW w:type="dxa" w:w="1020"/>
+            <w:vAlign w:val="top"/>
+            <w:shd w:val="clear" w:color="auto" w:fill="FDF0F7"/>
+          </w:tcPr>
+          <w:p>
+            <w:pPr>
+              <w:spacing w:after="20" w:line="252" w:lineRule="auto"/>
+            </w:pPr>
+            <w:r>
+              <w:rPr>
+                <w:b w:val="0"/>
+                <w:i w:val="0"/>
+                <w:sz w:val="15"/>
+              </w:rPr>
+              <w:t>Passed</w:t>
+            </w:r>
+          </w:p>
+        </w:tc>
+      </w:tr>
+      <w:tr>
+        <w:trPr>
+          <w:cantSplit/>
+        </w:trPr>
+        <w:tc>
+          <w:tcPr>
+            <w:tcW w:type="dxa" w:w="2494"/>
+            <w:vAlign w:val="top"/>
+          </w:tcPr>
+          <w:p>
+            <w:pPr>
+              <w:spacing w:after="20" w:line="252" w:lineRule="auto"/>
+            </w:pPr>
+            <w:r>
+              <w:rPr>
+                <w:b w:val="0"/>
+                <w:i w:val="0"/>
+                <w:sz w:val="15"/>
+              </w:rPr>
               <w:t>options.test.ts</w:t>
             </w:r>
           </w:p>
@@ -24824,6 +25272,196 @@
           <w:tcPr>
             <w:tcW w:type="dxa" w:w="6123"/>
             <w:vAlign w:val="top"/>
+          </w:tcPr>
+          <w:p>
+            <w:pPr>
+              <w:spacing w:after="20" w:line="252" w:lineRule="auto"/>
+            </w:pPr>
+            <w:r>
+              <w:rPr>
+                <w:b w:val="0"/>
+                <w:i w:val="0"/>
+                <w:sz w:val="15"/>
+              </w:rPr>
+              <w:t>label each code in sentence case</w:t>
+            </w:r>
+          </w:p>
+        </w:tc>
+        <w:tc>
+          <w:tcPr>
+            <w:tcW w:type="dxa" w:w="1020"/>
+            <w:vAlign w:val="top"/>
+          </w:tcPr>
+          <w:p>
+            <w:pPr>
+              <w:spacing w:after="20" w:line="252" w:lineRule="auto"/>
+            </w:pPr>
+            <w:r>
+              <w:rPr>
+                <w:b w:val="0"/>
+                <w:i w:val="0"/>
+                <w:sz w:val="15"/>
+              </w:rPr>
+              <w:t>Passed</w:t>
+            </w:r>
+          </w:p>
+        </w:tc>
+      </w:tr>
+      <w:tr>
+        <w:trPr>
+          <w:cantSplit/>
+        </w:trPr>
+        <w:tc>
+          <w:tcPr>
+            <w:tcW w:type="dxa" w:w="2494"/>
+            <w:vAlign w:val="top"/>
+            <w:shd w:val="clear" w:color="auto" w:fill="FDF0F7"/>
+          </w:tcPr>
+          <w:p>
+            <w:pPr>
+              <w:spacing w:after="20" w:line="252" w:lineRule="auto"/>
+            </w:pPr>
+            <w:r>
+              <w:rPr>
+                <w:b w:val="0"/>
+                <w:i w:val="0"/>
+                <w:sz w:val="15"/>
+              </w:rPr>
+              <w:t>options.test.ts</w:t>
+            </w:r>
+          </w:p>
+        </w:tc>
+        <w:tc>
+          <w:tcPr>
+            <w:tcW w:type="dxa" w:w="6123"/>
+            <w:vAlign w:val="top"/>
+            <w:shd w:val="clear" w:color="auto" w:fill="FDF0F7"/>
+          </w:tcPr>
+          <w:p>
+            <w:pPr>
+              <w:spacing w:after="20" w:line="252" w:lineRule="auto"/>
+            </w:pPr>
+            <w:r>
+              <w:rPr>
+                <w:b w:val="0"/>
+                <w:i w:val="0"/>
+                <w:sz w:val="15"/>
+              </w:rPr>
+              <w:t>uses the policy number once the policy is issued</w:t>
+            </w:r>
+          </w:p>
+        </w:tc>
+        <w:tc>
+          <w:tcPr>
+            <w:tcW w:type="dxa" w:w="1020"/>
+            <w:vAlign w:val="top"/>
+            <w:shd w:val="clear" w:color="auto" w:fill="FDF0F7"/>
+          </w:tcPr>
+          <w:p>
+            <w:pPr>
+              <w:spacing w:after="20" w:line="252" w:lineRule="auto"/>
+            </w:pPr>
+            <w:r>
+              <w:rPr>
+                <w:b w:val="0"/>
+                <w:i w:val="0"/>
+                <w:sz w:val="15"/>
+              </w:rPr>
+              <w:t>Passed</w:t>
+            </w:r>
+          </w:p>
+        </w:tc>
+      </w:tr>
+      <w:tr>
+        <w:trPr>
+          <w:cantSplit/>
+        </w:trPr>
+        <w:tc>
+          <w:tcPr>
+            <w:tcW w:type="dxa" w:w="2494"/>
+            <w:vAlign w:val="top"/>
+          </w:tcPr>
+          <w:p>
+            <w:pPr>
+              <w:spacing w:after="20" w:line="252" w:lineRule="auto"/>
+            </w:pPr>
+            <w:r>
+              <w:rPr>
+                <w:b w:val="0"/>
+                <w:i w:val="0"/>
+                <w:sz w:val="15"/>
+              </w:rPr>
+              <w:t>options.test.ts</w:t>
+            </w:r>
+          </w:p>
+        </w:tc>
+        <w:tc>
+          <w:tcPr>
+            <w:tcW w:type="dxa" w:w="6123"/>
+            <w:vAlign w:val="top"/>
+          </w:tcPr>
+          <w:p>
+            <w:pPr>
+              <w:spacing w:after="20" w:line="252" w:lineRule="auto"/>
+            </w:pPr>
+            <w:r>
+              <w:rPr>
+                <w:b w:val="0"/>
+                <w:i w:val="0"/>
+                <w:sz w:val="15"/>
+              </w:rPr>
+              <w:t>falls back to the quotation number before issuance</w:t>
+            </w:r>
+          </w:p>
+        </w:tc>
+        <w:tc>
+          <w:tcPr>
+            <w:tcW w:type="dxa" w:w="1020"/>
+            <w:vAlign w:val="top"/>
+          </w:tcPr>
+          <w:p>
+            <w:pPr>
+              <w:spacing w:after="20" w:line="252" w:lineRule="auto"/>
+            </w:pPr>
+            <w:r>
+              <w:rPr>
+                <w:b w:val="0"/>
+                <w:i w:val="0"/>
+                <w:sz w:val="15"/>
+              </w:rPr>
+              <w:t>Passed</w:t>
+            </w:r>
+          </w:p>
+        </w:tc>
+      </w:tr>
+      <w:tr>
+        <w:trPr>
+          <w:cantSplit/>
+        </w:trPr>
+        <w:tc>
+          <w:tcPr>
+            <w:tcW w:type="dxa" w:w="2494"/>
+            <w:vAlign w:val="top"/>
+            <w:shd w:val="clear" w:color="auto" w:fill="FDF0F7"/>
+          </w:tcPr>
+          <w:p>
+            <w:pPr>
+              <w:spacing w:after="20" w:line="252" w:lineRule="auto"/>
+            </w:pPr>
+            <w:r>
+              <w:rPr>
+                <w:b w:val="0"/>
+                <w:i w:val="0"/>
+                <w:sz w:val="15"/>
+              </w:rPr>
+              <w:t>options.test.ts</w:t>
+            </w:r>
+          </w:p>
+        </w:tc>
+        <w:tc>
+          <w:tcPr>
+            <w:tcW w:type="dxa" w:w="6123"/>
+            <w:vAlign w:val="top"/>
             <w:shd w:val="clear" w:color="auto" w:fill="FDF0F7"/>
           </w:tcPr>
           <w:p>
@@ -24845,6 +25483,449 @@
             <w:tcW w:type="dxa" w:w="1020"/>
             <w:vAlign w:val="top"/>
             <w:shd w:val="clear" w:color="auto" w:fill="FDF0F7"/>
+          </w:tcPr>
+          <w:p>
+            <w:pPr>
+              <w:spacing w:after="20" w:line="252" w:lineRule="auto"/>
+            </w:pPr>
+            <w:r>
+              <w:rPr>
+                <w:b w:val="0"/>
+                <w:i w:val="0"/>
+                <w:sz w:val="15"/>
+              </w:rPr>
+              <w:t>Passed</w:t>
+            </w:r>
+          </w:p>
+        </w:tc>
+      </w:tr>
+      <w:tr>
+        <w:trPr>
+          <w:cantSplit/>
+        </w:trPr>
+        <w:tc>
+          <w:tcPr>
+            <w:tcW w:type="dxa" w:w="2494"/>
+            <w:vAlign w:val="top"/>
+          </w:tcPr>
+          <w:p>
+            <w:pPr>
+              <w:spacing w:after="20" w:line="252" w:lineRule="auto"/>
+            </w:pPr>
+            <w:r>
+              <w:rPr>
+                <w:b w:val="0"/>
+                <w:i w:val="0"/>
+                <w:sz w:val="15"/>
+              </w:rPr>
+              <w:t>LoginPage.test.tsx</w:t>
+            </w:r>
+          </w:p>
+        </w:tc>
+        <w:tc>
+          <w:tcPr>
+            <w:tcW w:type="dxa" w:w="6123"/>
+            <w:vAlign w:val="top"/>
+          </w:tcPr>
+          <w:p>
+            <w:pPr>
+              <w:spacing w:after="20" w:line="252" w:lineRule="auto"/>
+            </w:pPr>
+            <w:r>
+              <w:rPr>
+                <w:b w:val="0"/>
+                <w:i w:val="0"/>
+                <w:sz w:val="15"/>
+              </w:rPr>
+              <w:t>renders the username and password fields</w:t>
+            </w:r>
+          </w:p>
+        </w:tc>
+        <w:tc>
+          <w:tcPr>
+            <w:tcW w:type="dxa" w:w="1020"/>
+            <w:vAlign w:val="top"/>
+          </w:tcPr>
+          <w:p>
+            <w:pPr>
+              <w:spacing w:after="20" w:line="252" w:lineRule="auto"/>
+            </w:pPr>
+            <w:r>
+              <w:rPr>
+                <w:b w:val="0"/>
+                <w:i w:val="0"/>
+                <w:sz w:val="15"/>
+              </w:rPr>
+              <w:t>Passed</w:t>
+            </w:r>
+          </w:p>
+        </w:tc>
+      </w:tr>
+      <w:tr>
+        <w:trPr>
+          <w:cantSplit/>
+        </w:trPr>
+        <w:tc>
+          <w:tcPr>
+            <w:tcW w:type="dxa" w:w="2494"/>
+            <w:vAlign w:val="top"/>
+            <w:shd w:val="clear" w:color="auto" w:fill="FDF0F7"/>
+          </w:tcPr>
+          <w:p>
+            <w:pPr>
+              <w:spacing w:after="20" w:line="252" w:lineRule="auto"/>
+            </w:pPr>
+            <w:r>
+              <w:rPr>
+                <w:b w:val="0"/>
+                <w:i w:val="0"/>
+                <w:sz w:val="15"/>
+              </w:rPr>
+              <w:t>LoginPage.test.tsx</w:t>
+            </w:r>
+          </w:p>
+        </w:tc>
+        <w:tc>
+          <w:tcPr>
+            <w:tcW w:type="dxa" w:w="6123"/>
+            <w:vAlign w:val="top"/>
+            <w:shd w:val="clear" w:color="auto" w:fill="FDF0F7"/>
+          </w:tcPr>
+          <w:p>
+            <w:pPr>
+              <w:spacing w:after="20" w:line="252" w:lineRule="auto"/>
+            </w:pPr>
+            <w:r>
+              <w:rPr>
+                <w:b w:val="0"/>
+                <w:i w:val="0"/>
+                <w:sz w:val="15"/>
+              </w:rPr>
+              <w:t>asks for both fields when submitted empty</w:t>
+            </w:r>
+          </w:p>
+        </w:tc>
+        <w:tc>
+          <w:tcPr>
+            <w:tcW w:type="dxa" w:w="1020"/>
+            <w:vAlign w:val="top"/>
+            <w:shd w:val="clear" w:color="auto" w:fill="FDF0F7"/>
+          </w:tcPr>
+          <w:p>
+            <w:pPr>
+              <w:spacing w:after="20" w:line="252" w:lineRule="auto"/>
+            </w:pPr>
+            <w:r>
+              <w:rPr>
+                <w:b w:val="0"/>
+                <w:i w:val="0"/>
+                <w:sz w:val="15"/>
+              </w:rPr>
+              <w:t>Passed</w:t>
+            </w:r>
+          </w:p>
+        </w:tc>
+      </w:tr>
+      <w:tr>
+        <w:trPr>
+          <w:cantSplit/>
+        </w:trPr>
+        <w:tc>
+          <w:tcPr>
+            <w:tcW w:type="dxa" w:w="2494"/>
+            <w:vAlign w:val="top"/>
+          </w:tcPr>
+          <w:p>
+            <w:pPr>
+              <w:spacing w:after="20" w:line="252" w:lineRule="auto"/>
+            </w:pPr>
+            <w:r>
+              <w:rPr>
+                <w:b w:val="0"/>
+                <w:i w:val="0"/>
+                <w:sz w:val="15"/>
+              </w:rPr>
+              <w:t>LoginPage.test.tsx</w:t>
+            </w:r>
+          </w:p>
+        </w:tc>
+        <w:tc>
+          <w:tcPr>
+            <w:tcW w:type="dxa" w:w="6123"/>
+            <w:vAlign w:val="top"/>
+          </w:tcPr>
+          <w:p>
+            <w:pPr>
+              <w:spacing w:after="20" w:line="252" w:lineRule="auto"/>
+            </w:pPr>
+            <w:r>
+              <w:rPr>
+                <w:b w:val="0"/>
+                <w:i w:val="0"/>
+                <w:sz w:val="15"/>
+              </w:rPr>
+              <w:t>signs in with the typed credentials and opens the home page</w:t>
+            </w:r>
+          </w:p>
+        </w:tc>
+        <w:tc>
+          <w:tcPr>
+            <w:tcW w:type="dxa" w:w="1020"/>
+            <w:vAlign w:val="top"/>
+          </w:tcPr>
+          <w:p>
+            <w:pPr>
+              <w:spacing w:after="20" w:line="252" w:lineRule="auto"/>
+            </w:pPr>
+            <w:r>
+              <w:rPr>
+                <w:b w:val="0"/>
+                <w:i w:val="0"/>
+                <w:sz w:val="15"/>
+              </w:rPr>
+              <w:t>Passed</w:t>
+            </w:r>
+          </w:p>
+        </w:tc>
+      </w:tr>
+      <w:tr>
+        <w:trPr>
+          <w:cantSplit/>
+        </w:trPr>
+        <w:tc>
+          <w:tcPr>
+            <w:tcW w:type="dxa" w:w="2494"/>
+            <w:vAlign w:val="top"/>
+            <w:shd w:val="clear" w:color="auto" w:fill="FDF0F7"/>
+          </w:tcPr>
+          <w:p>
+            <w:pPr>
+              <w:spacing w:after="20" w:line="252" w:lineRule="auto"/>
+            </w:pPr>
+            <w:r>
+              <w:rPr>
+                <w:b w:val="0"/>
+                <w:i w:val="0"/>
+                <w:sz w:val="15"/>
+              </w:rPr>
+              <w:t>LoginPage.test.tsx</w:t>
+            </w:r>
+          </w:p>
+        </w:tc>
+        <w:tc>
+          <w:tcPr>
+            <w:tcW w:type="dxa" w:w="6123"/>
+            <w:vAlign w:val="top"/>
+            <w:shd w:val="clear" w:color="auto" w:fill="FDF0F7"/>
+          </w:tcPr>
+          <w:p>
+            <w:pPr>
+              <w:spacing w:after="20" w:line="252" w:lineRule="auto"/>
+            </w:pPr>
+            <w:r>
+              <w:rPr>
+                <w:b w:val="0"/>
+                <w:i w:val="0"/>
+                <w:sz w:val="15"/>
+              </w:rPr>
+              <w:t>sends users who must change their password to the change-password page</w:t>
+            </w:r>
+          </w:p>
+        </w:tc>
+        <w:tc>
+          <w:tcPr>
+            <w:tcW w:type="dxa" w:w="1020"/>
+            <w:vAlign w:val="top"/>
+            <w:shd w:val="clear" w:color="auto" w:fill="FDF0F7"/>
+          </w:tcPr>
+          <w:p>
+            <w:pPr>
+              <w:spacing w:after="20" w:line="252" w:lineRule="auto"/>
+            </w:pPr>
+            <w:r>
+              <w:rPr>
+                <w:b w:val="0"/>
+                <w:i w:val="0"/>
+                <w:sz w:val="15"/>
+              </w:rPr>
+              <w:t>Passed</w:t>
+            </w:r>
+          </w:p>
+        </w:tc>
+      </w:tr>
+      <w:tr>
+        <w:trPr>
+          <w:cantSplit/>
+        </w:trPr>
+        <w:tc>
+          <w:tcPr>
+            <w:tcW w:type="dxa" w:w="2494"/>
+            <w:vAlign w:val="top"/>
+          </w:tcPr>
+          <w:p>
+            <w:pPr>
+              <w:spacing w:after="20" w:line="252" w:lineRule="auto"/>
+            </w:pPr>
+            <w:r>
+              <w:rPr>
+                <w:b w:val="0"/>
+                <w:i w:val="0"/>
+                <w:sz w:val="15"/>
+              </w:rPr>
+              <w:t>LoginPage.test.tsx</w:t>
+            </w:r>
+          </w:p>
+        </w:tc>
+        <w:tc>
+          <w:tcPr>
+            <w:tcW w:type="dxa" w:w="6123"/>
+            <w:vAlign w:val="top"/>
+          </w:tcPr>
+          <w:p>
+            <w:pPr>
+              <w:spacing w:after="20" w:line="252" w:lineRule="auto"/>
+            </w:pPr>
+            <w:r>
+              <w:rPr>
+                <w:b w:val="0"/>
+                <w:i w:val="0"/>
+                <w:sz w:val="15"/>
+              </w:rPr>
+              <w:t>shows the error returned for rejected credentials</w:t>
+            </w:r>
+          </w:p>
+        </w:tc>
+        <w:tc>
+          <w:tcPr>
+            <w:tcW w:type="dxa" w:w="1020"/>
+            <w:vAlign w:val="top"/>
+          </w:tcPr>
+          <w:p>
+            <w:pPr>
+              <w:spacing w:after="20" w:line="252" w:lineRule="auto"/>
+            </w:pPr>
+            <w:r>
+              <w:rPr>
+                <w:b w:val="0"/>
+                <w:i w:val="0"/>
+                <w:sz w:val="15"/>
+              </w:rPr>
+              <w:t>Passed</w:t>
+            </w:r>
+          </w:p>
+        </w:tc>
+      </w:tr>
+      <w:tr>
+        <w:trPr>
+          <w:cantSplit/>
+        </w:trPr>
+        <w:tc>
+          <w:tcPr>
+            <w:tcW w:type="dxa" w:w="2494"/>
+            <w:vAlign w:val="top"/>
+            <w:shd w:val="clear" w:color="auto" w:fill="FDF0F7"/>
+          </w:tcPr>
+          <w:p>
+            <w:pPr>
+              <w:spacing w:after="20" w:line="252" w:lineRule="auto"/>
+            </w:pPr>
+            <w:r>
+              <w:rPr>
+                <w:b w:val="0"/>
+                <w:i w:val="0"/>
+                <w:sz w:val="15"/>
+              </w:rPr>
+              <w:t>LoginPage.test.tsx</w:t>
+            </w:r>
+          </w:p>
+        </w:tc>
+        <w:tc>
+          <w:tcPr>
+            <w:tcW w:type="dxa" w:w="6123"/>
+            <w:vAlign w:val="top"/>
+            <w:shd w:val="clear" w:color="auto" w:fill="FDF0F7"/>
+          </w:tcPr>
+          <w:p>
+            <w:pPr>
+              <w:spacing w:after="20" w:line="252" w:lineRule="auto"/>
+            </w:pPr>
+            <w:r>
+              <w:rPr>
+                <w:b w:val="0"/>
+                <w:i w:val="0"/>
+                <w:sz w:val="15"/>
+              </w:rPr>
+              <w:t>shows the product, release and vendor credit without marketing copy</w:t>
+            </w:r>
+          </w:p>
+        </w:tc>
+        <w:tc>
+          <w:tcPr>
+            <w:tcW w:type="dxa" w:w="1020"/>
+            <w:vAlign w:val="top"/>
+            <w:shd w:val="clear" w:color="auto" w:fill="FDF0F7"/>
+          </w:tcPr>
+          <w:p>
+            <w:pPr>
+              <w:spacing w:after="20" w:line="252" w:lineRule="auto"/>
+            </w:pPr>
+            <w:r>
+              <w:rPr>
+                <w:b w:val="0"/>
+                <w:i w:val="0"/>
+                <w:sz w:val="15"/>
+              </w:rPr>
+              <w:t>Passed</w:t>
+            </w:r>
+          </w:p>
+        </w:tc>
+      </w:tr>
+      <w:tr>
+        <w:trPr>
+          <w:cantSplit/>
+        </w:trPr>
+        <w:tc>
+          <w:tcPr>
+            <w:tcW w:type="dxa" w:w="2494"/>
+            <w:vAlign w:val="top"/>
+          </w:tcPr>
+          <w:p>
+            <w:pPr>
+              <w:spacing w:after="20" w:line="252" w:lineRule="auto"/>
+            </w:pPr>
+            <w:r>
+              <w:rPr>
+                <w:b w:val="0"/>
+                <w:i w:val="0"/>
+                <w:sz w:val="15"/>
+              </w:rPr>
+              <w:t>LoginPage.test.tsx</w:t>
+            </w:r>
+          </w:p>
+        </w:tc>
+        <w:tc>
+          <w:tcPr>
+            <w:tcW w:type="dxa" w:w="6123"/>
+            <w:vAlign w:val="top"/>
+          </w:tcPr>
+          <w:p>
+            <w:pPr>
+              <w:spacing w:after="20" w:line="252" w:lineRule="auto"/>
+            </w:pPr>
+            <w:r>
+              <w:rPr>
+                <w:b w:val="0"/>
+                <w:i w:val="0"/>
+                <w:sz w:val="15"/>
+              </w:rPr>
+              <w:t>explains that the previous session ended</w:t>
+            </w:r>
+          </w:p>
+        </w:tc>
+        <w:tc>
+          <w:tcPr>
+            <w:tcW w:type="dxa" w:w="1020"/>
+            <w:vAlign w:val="top"/>
           </w:tcPr>
           <w:p>
             <w:pPr>
@@ -25732,7 +26813,7 @@
                 <w:i w:val="0"/>
                 <w:sz w:val="16"/>
               </w:rPr>
-              <w:t>9,886 bytes</w:t>
+              <w:t>9,866 bytes</w:t>
             </w:r>
           </w:p>
         </w:tc>
@@ -25752,7 +26833,7 @@
                 <w:i w:val="0"/>
                 <w:sz w:val="16"/>
               </w:rPr>
-              <w:t>78590222981eafd9…</w:t>
+              <w:t>b0f011f706552bf7…</w:t>
             </w:r>
           </w:p>
         </w:tc>
@@ -25814,7 +26895,7 @@
                 <w:i w:val="0"/>
                 <w:sz w:val="16"/>
               </w:rPr>
-              <w:t>21a8be1488eb17d7…</w:t>
+              <w:t>58df2467fc3b1a23…</w:t>
             </w:r>
           </w:p>
         </w:tc>
@@ -25922,7 +27003,7 @@
                 <w:i w:val="0"/>
                 <w:sz w:val="16"/>
               </w:rPr>
-              <w:t>24,628 bytes</w:t>
+              <w:t>28,448 bytes</w:t>
             </w:r>
           </w:p>
         </w:tc>
@@ -25941,7 +27022,7 @@
                 <w:i w:val="0"/>
                 <w:sz w:val="16"/>
               </w:rPr>
-              <w:t>7dac851fc00c909f…</w:t>
+              <w:t>c7df7b50d33b7c6b…</w:t>
             </w:r>
           </w:p>
         </w:tc>

</xml_diff>